<commit_message>
fix(bao cao): moi con so doc tu du lieu do; sua 5 cho con go tay lech so lieu
</commit_message>
<xml_diff>
--- a/docs/BaoCao_SafeRoadAI_BangC.docx
+++ b/docs/BaoCao_SafeRoadAI_BangC.docx
@@ -2310,7 +2310,7 @@
                 <w:sz w:val="20"/>
                 <w:szCs w:val="20"/>
               </w:rPr>
-              <w:t xml:space="preserve">180 s · 160 phương tiện · 69 nhãn near-miss</w:t>
+              <w:t xml:space="preserve">300 s · 315 phương tiện · 152 nhãn near-miss</w:t>
             </w:r>
           </w:p>
         </w:tc>
@@ -3403,7 +3403,7 @@
           <w:sz w:val="24"/>
           <w:szCs w:val="24"/>
         </w:rPr>
-        <w:t xml:space="preserve">Từng số hạng được lưu riêng, nhờ đó dashboard giải thích được vì sao một cảnh báo có mức rủi ro cao — đây chính là yêu cầu Explainable Risk. Bộ trọng số được hiệu chỉnh trên tập có nhãn để phân bố điểm trải đều; bộ chưa hiệu chỉnh đẩy trung vị lên 98/100, khi mọi cảnh báo đều "rất nguy hiểm" thì thang điểm không còn phân biệt được gì và người vận hành sẽ bỏ qua tất cả. Sau hiệu chỉnh, phân bố đạt phân vị 10 = 21, trung vị = 56, phân vị 90 = 89.</w:t>
+        <w:t xml:space="preserve">Từng số hạng được lưu riêng, nhờ đó dashboard giải thích được vì sao một cảnh báo có mức rủi ro cao — đây chính là yêu cầu Explainable Risk. Bộ trọng số được hiệu chỉnh trên tập có nhãn để phân bố điểm trải đều; bộ chưa hiệu chỉnh đẩy trung vị lên 98/100, khi mọi cảnh báo đều "rất nguy hiểm" thì thang điểm không còn phân biệt được gì và người vận hành sẽ bỏ qua tất cả. Sau hiệu chỉnh, phân bố trên 214 cảnh báo đạt phân vị 10 = 20, trung vị = 63, phân vị 90 = 90.</w:t>
       </w:r>
     </w:p>
     <w:p>
@@ -3439,7 +3439,7 @@
           <w:sz w:val="24"/>
           <w:szCs w:val="24"/>
         </w:rPr>
-        <w:t xml:space="preserve">Toàn bộ số liệu dưới đây sinh ra từ mã nguồn trong repo và tái lập được bằng các lệnh ghi trong README. Tập đánh giá: video mô phỏng 180 giây, 160 phương tiện, 69 nhãn near-miss chuẩn, seed 42. Detector được mô phỏng nhiễu 1.5 px và tỉ lệ bỏ sót 3%.</w:t>
+        <w:t xml:space="preserve">Toàn bộ số liệu dưới đây sinh ra từ mã nguồn trong repo và tái lập được bằng các lệnh ghi trong README. Tập đánh giá: video mô phỏng 300 giây, 315 phương tiện, 152 nhãn near-miss chuẩn, seed 42. Detector được mô phỏng nhiễu 1,5 px và tỉ lệ bỏ sót 3%.</w:t>
       </w:r>
     </w:p>
     <w:p>
@@ -3655,7 +3655,7 @@
                 <w:sz w:val="20"/>
                 <w:szCs w:val="20"/>
               </w:rPr>
-              <w:t xml:space="preserve">0.983</w:t>
+              <w:t xml:space="preserve">0,983</w:t>
             </w:r>
           </w:p>
         </w:tc>
@@ -3772,7 +3772,7 @@
                 <w:sz w:val="20"/>
                 <w:szCs w:val="20"/>
               </w:rPr>
-              <w:t xml:space="preserve">0.965</w:t>
+              <w:t xml:space="preserve">0,966</w:t>
             </w:r>
           </w:p>
         </w:tc>
@@ -3889,7 +3889,7 @@
                 <w:sz w:val="20"/>
                 <w:szCs w:val="20"/>
               </w:rPr>
-              <w:t xml:space="preserve">0.290 s</w:t>
+              <w:t xml:space="preserve">0,286 s</w:t>
             </w:r>
           </w:p>
         </w:tc>
@@ -4006,7 +4006,7 @@
                 <w:sz w:val="20"/>
                 <w:szCs w:val="20"/>
               </w:rPr>
-              <w:t xml:space="preserve">1.667 s</w:t>
+              <w:t xml:space="preserve">3,093 s</w:t>
             </w:r>
           </w:p>
         </w:tc>
@@ -4123,7 +4123,7 @@
                 <w:sz w:val="20"/>
                 <w:szCs w:val="20"/>
               </w:rPr>
-              <w:t xml:space="preserve">0.824</w:t>
+              <w:t xml:space="preserve">0,792</w:t>
             </w:r>
           </w:p>
         </w:tc>
@@ -4240,7 +4240,7 @@
                 <w:sz w:val="20"/>
                 <w:szCs w:val="20"/>
               </w:rPr>
-              <w:t xml:space="preserve">0.638</w:t>
+              <w:t xml:space="preserve">0,539</w:t>
             </w:r>
           </w:p>
         </w:tc>
@@ -4357,7 +4357,7 @@
                 <w:sz w:val="20"/>
                 <w:szCs w:val="20"/>
               </w:rPr>
-              <w:t xml:space="preserve">0.512</w:t>
+              <w:t xml:space="preserve">0,471</w:t>
             </w:r>
           </w:p>
         </w:tc>
@@ -4446,7 +4446,7 @@
                 <w:sz w:val="20"/>
                 <w:szCs w:val="20"/>
               </w:rPr>
-              <w:t xml:space="preserve">Tốc độ xử lý</w:t>
+              <w:t xml:space="preserve">Tốc độ xử lý (kèm ghi overlay)</w:t>
             </w:r>
           </w:p>
         </w:tc>
@@ -4474,7 +4474,7 @@
                 <w:sz w:val="20"/>
                 <w:szCs w:val="20"/>
               </w:rPr>
-              <w:t xml:space="preserve">44.5 FPS</w:t>
+              <w:t xml:space="preserve">39,0 FPS</w:t>
             </w:r>
           </w:p>
         </w:tc>
@@ -4563,7 +4563,7 @@
                 <w:sz w:val="20"/>
                 <w:szCs w:val="20"/>
               </w:rPr>
-              <w:t xml:space="preserve">Độ trễ end-to-end</w:t>
+              <w:t xml:space="preserve">Tốc độ lõi phân tích</w:t>
             </w:r>
           </w:p>
         </w:tc>
@@ -4591,7 +4591,241 @@
                 <w:sz w:val="20"/>
                 <w:szCs w:val="20"/>
               </w:rPr>
-              <w:t xml:space="preserve">19.9 ms/frame</w:t>
+              <w:t xml:space="preserve">141 FPS</w:t>
+            </w:r>
+          </w:p>
+        </w:tc>
+        <w:tc>
+          <w:tcPr>
+            <w:tcW w:type="dxa" w:w="2110"/>
+            <w:tcMar>
+              <w:top w:type="dxa" w:w="60"/>
+              <w:left w:type="dxa" w:w="90"/>
+              <w:bottom w:type="dxa" w:w="60"/>
+              <w:right w:type="dxa" w:w="90"/>
+            </w:tcMar>
+          </w:tcPr>
+          <w:p>
+            <w:pPr>
+              <w:spacing w:after="0" w:line="240"/>
+              <w:jc w:val="center"/>
+            </w:pPr>
+            <w:r>
+              <w:rPr>
+                <w:rFonts w:ascii="Times New Roman" w:cs="Times New Roman" w:eastAsia="Times New Roman" w:hAnsi="Times New Roman"/>
+                <w:b w:val="false"/>
+                <w:bCs w:val="false"/>
+                <w:color w:val="000000"/>
+                <w:sz w:val="20"/>
+                <w:szCs w:val="20"/>
+              </w:rPr>
+              <w:t xml:space="preserve">≥ 25 FPS</w:t>
+            </w:r>
+          </w:p>
+        </w:tc>
+        <w:tc>
+          <w:tcPr>
+            <w:tcW w:type="dxa" w:w="1687"/>
+            <w:tcMar>
+              <w:top w:type="dxa" w:w="60"/>
+              <w:left w:type="dxa" w:w="90"/>
+              <w:bottom w:type="dxa" w:w="60"/>
+              <w:right w:type="dxa" w:w="90"/>
+            </w:tcMar>
+          </w:tcPr>
+          <w:p>
+            <w:pPr>
+              <w:spacing w:after="0" w:line="240"/>
+              <w:jc w:val="center"/>
+            </w:pPr>
+            <w:r>
+              <w:rPr>
+                <w:rFonts w:ascii="Times New Roman" w:cs="Times New Roman" w:eastAsia="Times New Roman" w:hAnsi="Times New Roman"/>
+                <w:b w:val="false"/>
+                <w:bCs w:val="false"/>
+                <w:color w:val="000000"/>
+                <w:sz w:val="20"/>
+                <w:szCs w:val="20"/>
+              </w:rPr>
+              <w:t xml:space="preserve">Đạt</w:t>
+            </w:r>
+          </w:p>
+        </w:tc>
+      </w:tr>
+      <w:tr>
+        <w:trPr>
+          <w:cantSplit/>
+        </w:trPr>
+        <w:tc>
+          <w:tcPr>
+            <w:tcW w:type="dxa" w:w="2954"/>
+            <w:tcMar>
+              <w:top w:type="dxa" w:w="60"/>
+              <w:left w:type="dxa" w:w="90"/>
+              <w:bottom w:type="dxa" w:w="60"/>
+              <w:right w:type="dxa" w:w="90"/>
+            </w:tcMar>
+          </w:tcPr>
+          <w:p>
+            <w:pPr>
+              <w:spacing w:after="0" w:line="240"/>
+              <w:jc w:val="left"/>
+            </w:pPr>
+            <w:r>
+              <w:rPr>
+                <w:rFonts w:ascii="Times New Roman" w:cs="Times New Roman" w:eastAsia="Times New Roman" w:hAnsi="Times New Roman"/>
+                <w:b w:val="false"/>
+                <w:bCs w:val="false"/>
+                <w:color w:val="000000"/>
+                <w:sz w:val="20"/>
+                <w:szCs w:val="20"/>
+              </w:rPr>
+              <w:t xml:space="preserve">Độ trễ trung vị</w:t>
+            </w:r>
+          </w:p>
+        </w:tc>
+        <w:tc>
+          <w:tcPr>
+            <w:tcW w:type="dxa" w:w="2321"/>
+            <w:tcMar>
+              <w:top w:type="dxa" w:w="60"/>
+              <w:left w:type="dxa" w:w="90"/>
+              <w:bottom w:type="dxa" w:w="60"/>
+              <w:right w:type="dxa" w:w="90"/>
+            </w:tcMar>
+          </w:tcPr>
+          <w:p>
+            <w:pPr>
+              <w:spacing w:after="0" w:line="240"/>
+              <w:jc w:val="center"/>
+            </w:pPr>
+            <w:r>
+              <w:rPr>
+                <w:rFonts w:ascii="Times New Roman" w:cs="Times New Roman" w:eastAsia="Times New Roman" w:hAnsi="Times New Roman"/>
+                <w:b w:val="false"/>
+                <w:bCs w:val="false"/>
+                <w:color w:val="000000"/>
+                <w:sz w:val="20"/>
+                <w:szCs w:val="20"/>
+              </w:rPr>
+              <w:t xml:space="preserve">25,7 ms/frame</w:t>
+            </w:r>
+          </w:p>
+        </w:tc>
+        <w:tc>
+          <w:tcPr>
+            <w:tcW w:type="dxa" w:w="2110"/>
+            <w:tcMar>
+              <w:top w:type="dxa" w:w="60"/>
+              <w:left w:type="dxa" w:w="90"/>
+              <w:bottom w:type="dxa" w:w="60"/>
+              <w:right w:type="dxa" w:w="90"/>
+            </w:tcMar>
+          </w:tcPr>
+          <w:p>
+            <w:pPr>
+              <w:spacing w:after="0" w:line="240"/>
+              <w:jc w:val="center"/>
+            </w:pPr>
+            <w:r>
+              <w:rPr>
+                <w:rFonts w:ascii="Times New Roman" w:cs="Times New Roman" w:eastAsia="Times New Roman" w:hAnsi="Times New Roman"/>
+                <w:b w:val="false"/>
+                <w:bCs w:val="false"/>
+                <w:color w:val="000000"/>
+                <w:sz w:val="20"/>
+                <w:szCs w:val="20"/>
+              </w:rPr>
+              <w:t xml:space="preserve">≤ 1,5 s</w:t>
+            </w:r>
+          </w:p>
+        </w:tc>
+        <w:tc>
+          <w:tcPr>
+            <w:tcW w:type="dxa" w:w="1687"/>
+            <w:tcMar>
+              <w:top w:type="dxa" w:w="60"/>
+              <w:left w:type="dxa" w:w="90"/>
+              <w:bottom w:type="dxa" w:w="60"/>
+              <w:right w:type="dxa" w:w="90"/>
+            </w:tcMar>
+          </w:tcPr>
+          <w:p>
+            <w:pPr>
+              <w:spacing w:after="0" w:line="240"/>
+              <w:jc w:val="center"/>
+            </w:pPr>
+            <w:r>
+              <w:rPr>
+                <w:rFonts w:ascii="Times New Roman" w:cs="Times New Roman" w:eastAsia="Times New Roman" w:hAnsi="Times New Roman"/>
+                <w:b w:val="false"/>
+                <w:bCs w:val="false"/>
+                <w:color w:val="000000"/>
+                <w:sz w:val="20"/>
+                <w:szCs w:val="20"/>
+              </w:rPr>
+              <w:t xml:space="preserve">Đạt</w:t>
+            </w:r>
+          </w:p>
+        </w:tc>
+      </w:tr>
+      <w:tr>
+        <w:trPr>
+          <w:cantSplit/>
+        </w:trPr>
+        <w:tc>
+          <w:tcPr>
+            <w:tcW w:type="dxa" w:w="2954"/>
+            <w:tcMar>
+              <w:top w:type="dxa" w:w="60"/>
+              <w:left w:type="dxa" w:w="90"/>
+              <w:bottom w:type="dxa" w:w="60"/>
+              <w:right w:type="dxa" w:w="90"/>
+            </w:tcMar>
+          </w:tcPr>
+          <w:p>
+            <w:pPr>
+              <w:spacing w:after="0" w:line="240"/>
+              <w:jc w:val="left"/>
+            </w:pPr>
+            <w:r>
+              <w:rPr>
+                <w:rFonts w:ascii="Times New Roman" w:cs="Times New Roman" w:eastAsia="Times New Roman" w:hAnsi="Times New Roman"/>
+                <w:b w:val="false"/>
+                <w:bCs w:val="false"/>
+                <w:color w:val="000000"/>
+                <w:sz w:val="20"/>
+                <w:szCs w:val="20"/>
+              </w:rPr>
+              <w:t xml:space="preserve">Độ trễ p95</w:t>
+            </w:r>
+          </w:p>
+        </w:tc>
+        <w:tc>
+          <w:tcPr>
+            <w:tcW w:type="dxa" w:w="2321"/>
+            <w:tcMar>
+              <w:top w:type="dxa" w:w="60"/>
+              <w:left w:type="dxa" w:w="90"/>
+              <w:bottom w:type="dxa" w:w="60"/>
+              <w:right w:type="dxa" w:w="90"/>
+            </w:tcMar>
+          </w:tcPr>
+          <w:p>
+            <w:pPr>
+              <w:spacing w:after="0" w:line="240"/>
+              <w:jc w:val="center"/>
+            </w:pPr>
+            <w:r>
+              <w:rPr>
+                <w:rFonts w:ascii="Times New Roman" w:cs="Times New Roman" w:eastAsia="Times New Roman" w:hAnsi="Times New Roman"/>
+                <w:b w:val="false"/>
+                <w:bCs w:val="false"/>
+                <w:color w:val="000000"/>
+                <w:sz w:val="20"/>
+                <w:szCs w:val="20"/>
+              </w:rPr>
+              <w:t xml:space="preserve">34,0 ms/frame</w:t>
             </w:r>
           </w:p>
         </w:tc>
@@ -4653,6 +4887,20 @@
         </w:tc>
       </w:tr>
     </w:tbl>
+    <w:p>
+      <w:pPr>
+        <w:spacing w:after="120" w:line="276"/>
+        <w:jc w:val="both"/>
+      </w:pPr>
+      <w:r>
+        <w:rPr>
+          <w:rFonts w:ascii="Times New Roman" w:cs="Times New Roman" w:eastAsia="Times New Roman" w:hAnsi="Times New Roman"/>
+          <w:sz w:val="24"/>
+          <w:szCs w:val="24"/>
+        </w:rPr>
+        <w:t xml:space="preserve">Hai con số tốc độ lệch nhau vì một lý do cần nói rõ: khâu vẽ và ghi video overlay chiếm 11,9 ms trong 18,8 ms tổng thời gian các khâu xử lý, tức 63% — phần lớn thời gian không dùng để phân tích mà để tạo video minh hoạ. (Trung vị đầu-cuối 25,7 ms ở bảng trên lớn hơn tổng này vì còn tính cả thời gian đọc và giải mã khung hình.) Overlay chỉ cần cho demo và kiểm tra bằng mắt; khi triển khai thật hệ thống chỉ xuất cảnh báo và số liệu, nên tốc độ thực tế là con số ở dòng thứ hai. Cả hai đều đo bằng trung vị độ trễ từng frame thay vì chia tổng thời gian chạy cho số frame — cách sau bị sai lệch hoàn toàn nếu máy đo ngủ, bị throttle nhiệt, hoặc có tiến trình khác giành CPU.</w:t>
+      </w:r>
+    </w:p>
     <w:p>
       <w:pPr>
         <w:pStyle w:val="Heading2"/>
@@ -4882,7 +5130,7 @@
                 <w:sz w:val="20"/>
                 <w:szCs w:val="20"/>
               </w:rPr>
-              <w:t xml:space="preserve">Rất nghiêm trọng (TTC&lt;1.0s)</w:t>
+              <w:t xml:space="preserve">Rất nghiêm trọng (TTC&lt;1,0s)</w:t>
             </w:r>
           </w:p>
         </w:tc>
@@ -4910,7 +5158,7 @@
                 <w:sz w:val="20"/>
                 <w:szCs w:val="20"/>
               </w:rPr>
-              <w:t xml:space="preserve">34</w:t>
+              <w:t xml:space="preserve">77</w:t>
             </w:r>
           </w:p>
         </w:tc>
@@ -4938,7 +5186,7 @@
                 <w:sz w:val="20"/>
                 <w:szCs w:val="20"/>
               </w:rPr>
-              <w:t xml:space="preserve">28</w:t>
+              <w:t xml:space="preserve">61</w:t>
             </w:r>
           </w:p>
         </w:tc>
@@ -4966,7 +5214,7 @@
                 <w:sz w:val="20"/>
                 <w:szCs w:val="20"/>
               </w:rPr>
-              <w:t xml:space="preserve">0.824</w:t>
+              <w:t xml:space="preserve">0,792</w:t>
             </w:r>
           </w:p>
         </w:tc>
@@ -4994,7 +5242,7 @@
                 <w:sz w:val="20"/>
                 <w:szCs w:val="20"/>
               </w:rPr>
-              <w:t xml:space="preserve">0.205 s</w:t>
+              <w:t xml:space="preserve">0,146 s</w:t>
             </w:r>
           </w:p>
         </w:tc>
@@ -5027,7 +5275,7 @@
                 <w:sz w:val="20"/>
                 <w:szCs w:val="20"/>
               </w:rPr>
-              <w:t xml:space="preserve">Nghiêm trọng (1.0-1.5s)</w:t>
+              <w:t xml:space="preserve">Nghiêm trọng (1,0-1,5s)</w:t>
             </w:r>
           </w:p>
         </w:tc>
@@ -5055,7 +5303,7 @@
                 <w:sz w:val="20"/>
                 <w:szCs w:val="20"/>
               </w:rPr>
-              <w:t xml:space="preserve">8</w:t>
+              <w:t xml:space="preserve">18</w:t>
             </w:r>
           </w:p>
         </w:tc>
@@ -5083,7 +5331,7 @@
                 <w:sz w:val="20"/>
                 <w:szCs w:val="20"/>
               </w:rPr>
-              <w:t xml:space="preserve">5</w:t>
+              <w:t xml:space="preserve">12</w:t>
             </w:r>
           </w:p>
         </w:tc>
@@ -5111,7 +5359,7 @@
                 <w:sz w:val="20"/>
                 <w:szCs w:val="20"/>
               </w:rPr>
-              <w:t xml:space="preserve">0.625</w:t>
+              <w:t xml:space="preserve">0,667</w:t>
             </w:r>
           </w:p>
         </w:tc>
@@ -5139,7 +5387,7 @@
                 <w:sz w:val="20"/>
                 <w:szCs w:val="20"/>
               </w:rPr>
-              <w:t xml:space="preserve">0.704 s</w:t>
+              <w:t xml:space="preserve">0,525 s</w:t>
             </w:r>
           </w:p>
         </w:tc>
@@ -5172,7 +5420,7 @@
                 <w:sz w:val="20"/>
                 <w:szCs w:val="20"/>
               </w:rPr>
-              <w:t xml:space="preserve">Trung bình (1.5-2.5s)</w:t>
+              <w:t xml:space="preserve">Trung bình (1,5-2,5s)</w:t>
             </w:r>
           </w:p>
         </w:tc>
@@ -5200,40 +5448,40 @@
                 <w:sz w:val="20"/>
                 <w:szCs w:val="20"/>
               </w:rPr>
+              <w:t xml:space="preserve">16</w:t>
+            </w:r>
+          </w:p>
+        </w:tc>
+        <w:tc>
+          <w:tcPr>
+            <w:tcW w:type="dxa" w:w="1512"/>
+            <w:tcMar>
+              <w:top w:type="dxa" w:w="60"/>
+              <w:left w:type="dxa" w:w="90"/>
+              <w:bottom w:type="dxa" w:w="60"/>
+              <w:right w:type="dxa" w:w="90"/>
+            </w:tcMar>
+          </w:tcPr>
+          <w:p>
+            <w:pPr>
+              <w:spacing w:after="0" w:line="240"/>
+              <w:jc w:val="center"/>
+            </w:pPr>
+            <w:r>
+              <w:rPr>
+                <w:rFonts w:ascii="Times New Roman" w:cs="Times New Roman" w:eastAsia="Times New Roman" w:hAnsi="Times New Roman"/>
+                <w:b w:val="false"/>
+                <w:bCs w:val="false"/>
+                <w:color w:val="000000"/>
+                <w:sz w:val="20"/>
+                <w:szCs w:val="20"/>
+              </w:rPr>
               <w:t xml:space="preserve">3</w:t>
             </w:r>
           </w:p>
         </w:tc>
         <w:tc>
           <w:tcPr>
-            <w:tcW w:type="dxa" w:w="1512"/>
-            <w:tcMar>
-              <w:top w:type="dxa" w:w="60"/>
-              <w:left w:type="dxa" w:w="90"/>
-              <w:bottom w:type="dxa" w:w="60"/>
-              <w:right w:type="dxa" w:w="90"/>
-            </w:tcMar>
-          </w:tcPr>
-          <w:p>
-            <w:pPr>
-              <w:spacing w:after="0" w:line="240"/>
-              <w:jc w:val="center"/>
-            </w:pPr>
-            <w:r>
-              <w:rPr>
-                <w:rFonts w:ascii="Times New Roman" w:cs="Times New Roman" w:eastAsia="Times New Roman" w:hAnsi="Times New Roman"/>
-                <w:b w:val="false"/>
-                <w:bCs w:val="false"/>
-                <w:color w:val="000000"/>
-                <w:sz w:val="20"/>
-                <w:szCs w:val="20"/>
-              </w:rPr>
-              <w:t xml:space="preserve">1</w:t>
-            </w:r>
-          </w:p>
-        </w:tc>
-        <w:tc>
-          <w:tcPr>
             <w:tcW w:type="dxa" w:w="1344"/>
             <w:tcMar>
               <w:top w:type="dxa" w:w="60"/>
@@ -5256,7 +5504,7 @@
                 <w:sz w:val="20"/>
                 <w:szCs w:val="20"/>
               </w:rPr>
-              <w:t xml:space="preserve">0.333</w:t>
+              <w:t xml:space="preserve">0,188</w:t>
             </w:r>
           </w:p>
         </w:tc>
@@ -5284,7 +5532,7 @@
                 <w:sz w:val="20"/>
                 <w:szCs w:val="20"/>
               </w:rPr>
-              <w:t xml:space="preserve">0.619 s</w:t>
+              <w:t xml:space="preserve">1,457 s</w:t>
             </w:r>
           </w:p>
         </w:tc>
@@ -5317,7 +5565,7 @@
                 <w:sz w:val="20"/>
                 <w:szCs w:val="20"/>
               </w:rPr>
-              <w:t xml:space="preserve">Nhẹ (2.5-3.0s)</w:t>
+              <w:t xml:space="preserve">Nhẹ (2,5-3,0s)</w:t>
             </w:r>
           </w:p>
         </w:tc>
@@ -5345,7 +5593,7 @@
                 <w:sz w:val="20"/>
                 <w:szCs w:val="20"/>
               </w:rPr>
-              <w:t xml:space="preserve">2</w:t>
+              <w:t xml:space="preserve">8</w:t>
             </w:r>
           </w:p>
         </w:tc>
@@ -5373,7 +5621,7 @@
                 <w:sz w:val="20"/>
                 <w:szCs w:val="20"/>
               </w:rPr>
-              <w:t xml:space="preserve">0</w:t>
+              <w:t xml:space="preserve">1</w:t>
             </w:r>
           </w:p>
         </w:tc>
@@ -5401,7 +5649,7 @@
                 <w:sz w:val="20"/>
                 <w:szCs w:val="20"/>
               </w:rPr>
-              <w:t xml:space="preserve">0.000</w:t>
+              <w:t xml:space="preserve">0,125</w:t>
             </w:r>
           </w:p>
         </w:tc>
@@ -5429,7 +5677,7 @@
                 <w:sz w:val="20"/>
                 <w:szCs w:val="20"/>
               </w:rPr>
-              <w:t xml:space="preserve">—</w:t>
+              <w:t xml:space="preserve">2,443 s</w:t>
             </w:r>
           </w:p>
         </w:tc>
@@ -5456,7 +5704,7 @@
           <w:sz w:val="24"/>
           <w:szCs w:val="24"/>
         </w:rPr>
-        <w:t xml:space="preserve">Recall đạt 0.824 với các tình huống TTC dưới 1 giây, và giảm dần ở các dải nhẹ hơn. Đây là hành vi mong muốn: một hệ thống cảnh báo an toàn nên ưu tiên không bỏ sót tình huống nguy cấp, chấp nhận bỏ qua các tình huống ở ranh giới.</w:t>
+        <w:t xml:space="preserve">Recall đạt 0,792 với các tình huống TTC dưới 1 giây, và giảm dần ở các dải nhẹ hơn. Đây là hành vi mong muốn: một hệ thống cảnh báo an toàn nên ưu tiên không bỏ sót tình huống nguy cấp, chấp nhận bỏ qua các tình huống ở ranh giới.</w:t>
       </w:r>
     </w:p>
     <w:p>
@@ -5746,7 +5994,7 @@
                 <w:sz w:val="20"/>
                 <w:szCs w:val="20"/>
               </w:rPr>
-              <w:t xml:space="preserve">0.000</w:t>
+              <w:t xml:space="preserve">0,035</w:t>
             </w:r>
           </w:p>
         </w:tc>
@@ -5774,7 +6022,7 @@
                 <w:sz w:val="20"/>
                 <w:szCs w:val="20"/>
               </w:rPr>
-              <w:t xml:space="preserve">0.000</w:t>
+              <w:t xml:space="preserve">0,020</w:t>
             </w:r>
           </w:p>
         </w:tc>
@@ -5802,7 +6050,7 @@
                 <w:sz w:val="20"/>
                 <w:szCs w:val="20"/>
               </w:rPr>
-              <w:t xml:space="preserve">0.000</w:t>
+              <w:t xml:space="preserve">0,025</w:t>
             </w:r>
           </w:p>
         </w:tc>
@@ -5830,7 +6078,7 @@
                 <w:sz w:val="20"/>
                 <w:szCs w:val="20"/>
               </w:rPr>
-              <w:t xml:space="preserve">—</w:t>
+              <w:t xml:space="preserve">0,704</w:t>
             </w:r>
           </w:p>
         </w:tc>
@@ -5858,7 +6106,7 @@
                 <w:sz w:val="20"/>
                 <w:szCs w:val="20"/>
               </w:rPr>
-              <w:t xml:space="preserve">242</w:t>
+              <w:t xml:space="preserve">445</w:t>
             </w:r>
           </w:p>
         </w:tc>
@@ -5919,7 +6167,7 @@
                 <w:sz w:val="20"/>
                 <w:szCs w:val="20"/>
               </w:rPr>
-              <w:t xml:space="preserve">0.062</w:t>
+              <w:t xml:space="preserve">0,075</w:t>
             </w:r>
           </w:p>
         </w:tc>
@@ -5947,7 +6195,7 @@
                 <w:sz w:val="20"/>
                 <w:szCs w:val="20"/>
               </w:rPr>
-              <w:t xml:space="preserve">0.768</w:t>
+              <w:t xml:space="preserve">0,684</w:t>
             </w:r>
           </w:p>
         </w:tc>
@@ -5975,7 +6223,7 @@
                 <w:sz w:val="20"/>
                 <w:szCs w:val="20"/>
               </w:rPr>
-              <w:t xml:space="preserve">0.114</w:t>
+              <w:t xml:space="preserve">0,135</w:t>
             </w:r>
           </w:p>
         </w:tc>
@@ -6003,7 +6251,7 @@
                 <w:sz w:val="20"/>
                 <w:szCs w:val="20"/>
               </w:rPr>
-              <w:t xml:space="preserve">0.352</w:t>
+              <w:t xml:space="preserve">0,395</w:t>
             </w:r>
           </w:p>
         </w:tc>
@@ -6031,7 +6279,7 @@
                 <w:sz w:val="20"/>
                 <w:szCs w:val="20"/>
               </w:rPr>
-              <w:t xml:space="preserve">1004</w:t>
+              <w:t xml:space="preserve">1711</w:t>
             </w:r>
           </w:p>
         </w:tc>
@@ -6092,7 +6340,7 @@
                 <w:sz w:val="20"/>
                 <w:szCs w:val="20"/>
               </w:rPr>
-              <w:t xml:space="preserve">0.110</w:t>
+              <w:t xml:space="preserve">0,154</w:t>
             </w:r>
           </w:p>
         </w:tc>
@@ -6120,7 +6368,7 @@
                 <w:sz w:val="20"/>
                 <w:szCs w:val="20"/>
               </w:rPr>
-              <w:t xml:space="preserve">0.609</w:t>
+              <w:t xml:space="preserve">0,678</w:t>
             </w:r>
           </w:p>
         </w:tc>
@@ -6148,7 +6396,7 @@
                 <w:sz w:val="20"/>
                 <w:szCs w:val="20"/>
               </w:rPr>
-              <w:t xml:space="preserve">0.186</w:t>
+              <w:t xml:space="preserve">0,251</w:t>
             </w:r>
           </w:p>
         </w:tc>
@@ -6176,7 +6424,7 @@
                 <w:sz w:val="20"/>
                 <w:szCs w:val="20"/>
               </w:rPr>
-              <w:t xml:space="preserve">0.297</w:t>
+              <w:t xml:space="preserve">0,272</w:t>
             </w:r>
           </w:p>
         </w:tc>
@@ -6204,7 +6452,7 @@
                 <w:sz w:val="20"/>
                 <w:szCs w:val="20"/>
               </w:rPr>
-              <w:t xml:space="preserve">468</w:t>
+              <w:t xml:space="preserve">860</w:t>
             </w:r>
           </w:p>
         </w:tc>
@@ -6265,7 +6513,7 @@
                 <w:sz w:val="20"/>
                 <w:szCs w:val="20"/>
               </w:rPr>
-              <w:t xml:space="preserve">0.093</w:t>
+              <w:t xml:space="preserve">0,103</w:t>
             </w:r>
           </w:p>
         </w:tc>
@@ -6293,7 +6541,7 @@
                 <w:sz w:val="20"/>
                 <w:szCs w:val="20"/>
               </w:rPr>
-              <w:t xml:space="preserve">0.725</w:t>
+              <w:t xml:space="preserve">0,711</w:t>
             </w:r>
           </w:p>
         </w:tc>
@@ -6321,7 +6569,7 @@
                 <w:sz w:val="20"/>
                 <w:szCs w:val="20"/>
               </w:rPr>
-              <w:t xml:space="preserve">0.165</w:t>
+              <w:t xml:space="preserve">0,180</w:t>
             </w:r>
           </w:p>
         </w:tc>
@@ -6349,7 +6597,7 @@
                 <w:sz w:val="20"/>
                 <w:szCs w:val="20"/>
               </w:rPr>
-              <w:t xml:space="preserve">0.281</w:t>
+              <w:t xml:space="preserve">0,271</w:t>
             </w:r>
           </w:p>
         </w:tc>
@@ -6377,7 +6625,7 @@
                 <w:sz w:val="20"/>
                 <w:szCs w:val="20"/>
               </w:rPr>
-              <w:t xml:space="preserve">625</w:t>
+              <w:t xml:space="preserve">1249</w:t>
             </w:r>
           </w:p>
         </w:tc>
@@ -6438,7 +6686,7 @@
                 <w:sz w:val="20"/>
                 <w:szCs w:val="20"/>
               </w:rPr>
-              <w:t xml:space="preserve">0.512</w:t>
+              <w:t xml:space="preserve">0,471</w:t>
             </w:r>
           </w:p>
         </w:tc>
@@ -6466,7 +6714,7 @@
                 <w:sz w:val="20"/>
                 <w:szCs w:val="20"/>
               </w:rPr>
-              <w:t xml:space="preserve">0.638</w:t>
+              <w:t xml:space="preserve">0,539</w:t>
             </w:r>
           </w:p>
         </w:tc>
@@ -6494,7 +6742,7 @@
                 <w:sz w:val="20"/>
                 <w:szCs w:val="20"/>
               </w:rPr>
-              <w:t xml:space="preserve">0.568</w:t>
+              <w:t xml:space="preserve">0,503</w:t>
             </w:r>
           </w:p>
         </w:tc>
@@ -6522,7 +6770,7 @@
                 <w:sz w:val="20"/>
                 <w:szCs w:val="20"/>
               </w:rPr>
-              <w:t xml:space="preserve">0.290</w:t>
+              <w:t xml:space="preserve">0,286</w:t>
             </w:r>
           </w:p>
         </w:tc>
@@ -6550,7 +6798,7 @@
                 <w:sz w:val="20"/>
                 <w:szCs w:val="20"/>
               </w:rPr>
-              <w:t xml:space="preserve">100</w:t>
+              <w:t xml:space="preserve">211</w:t>
             </w:r>
           </w:p>
         </w:tc>
@@ -6611,7 +6859,7 @@
                 <w:sz w:val="20"/>
                 <w:szCs w:val="20"/>
               </w:rPr>
-              <w:t xml:space="preserve">0.512</w:t>
+              <w:t xml:space="preserve">0,471</w:t>
             </w:r>
           </w:p>
         </w:tc>
@@ -6639,7 +6887,7 @@
                 <w:sz w:val="20"/>
                 <w:szCs w:val="20"/>
               </w:rPr>
-              <w:t xml:space="preserve">0.638</w:t>
+              <w:t xml:space="preserve">0,539</w:t>
             </w:r>
           </w:p>
         </w:tc>
@@ -6667,7 +6915,7 @@
                 <w:sz w:val="20"/>
                 <w:szCs w:val="20"/>
               </w:rPr>
-              <w:t xml:space="preserve">0.568</w:t>
+              <w:t xml:space="preserve">0,503</w:t>
             </w:r>
           </w:p>
         </w:tc>
@@ -6695,7 +6943,7 @@
                 <w:sz w:val="20"/>
                 <w:szCs w:val="20"/>
               </w:rPr>
-              <w:t xml:space="preserve">0.290</w:t>
+              <w:t xml:space="preserve">0,286</w:t>
             </w:r>
           </w:p>
         </w:tc>
@@ -6723,7 +6971,7 @@
                 <w:sz w:val="20"/>
                 <w:szCs w:val="20"/>
               </w:rPr>
-              <w:t xml:space="preserve">100</w:t>
+              <w:t xml:space="preserve">211</w:t>
             </w:r>
           </w:p>
         </w:tc>
@@ -6759,7 +7007,7 @@
           <w:sz w:val="24"/>
           <w:szCs w:val="24"/>
         </w:rPr>
-        <w:t xml:space="preserve">Homography làm Recall nhảy từ 0 lên trên 0,75 — vì trước đó TTC được tính trên đơn vị pixel, vốn không phải đại lượng vật lý, nên hầu như không sự kiện nào khớp với nhãn chuẩn.</w:t>
+        <w:t xml:space="preserve">Homography làm Recall nhảy từ 0,020 lên 0,684 — vì trước đó TTC được tính trên đơn vị pixel, vốn không phải đại lượng vật lý, nên hầu như không sự kiện nào khớp với nhãn chuẩn.</w:t>
       </w:r>
     </w:p>
     <w:p>
@@ -6797,7 +7045,7 @@
           <w:sz w:val="24"/>
           <w:szCs w:val="24"/>
         </w:rPr>
-        <w:t xml:space="preserve">PET nâng Recall thêm khoảng 12 điểm — bắt được nhóm tình huống "vừa lướt qua" mà TTC bỏ sót.</w:t>
+        <w:t xml:space="preserve">PET nâng Recall thêm 3,3 điểm phần trăm — bắt được nhóm tình huống "vừa lướt qua" mà TTC bỏ sót. Mức tăng nhỏ nhưng đúng nhóm: đây là những tình huống mà chỉ số TTC về nguyên tắc không thể phát hiện.</w:t>
       </w:r>
     </w:p>
     <w:p>
@@ -6816,7 +7064,7 @@
           <w:sz w:val="24"/>
           <w:szCs w:val="24"/>
         </w:rPr>
-        <w:t xml:space="preserve">Cổng khoảng cách là bước có tác dụng lớn nhất: Precision tăng gấp hơn năm lần (0,09 → 0,51) trong khi Recall gần như không đổi. Đây là bằng chứng thực nghiệm cho luận điểm ở mục 6.3.</w:t>
+        <w:t xml:space="preserve">Cổng khoảng cách là bước có tác dụng lớn nhất lên F1: Precision tăng gấp 4,6 lần (0,103 → 0,471), đổi lại Recall giảm 17,1 điểm phần trăm (0,711 → 0,539). Đây là một đánh đổi có chủ ý, không phải cải thiện miễn phí: 1249 sự kiện bị lọc xuống còn 211, trong đó có cả một phần near-miss thật. Chúng tôi chọn cấu hình này vì F1 tăng từ 0,180 lên 0,503 và vì Recall ở dải nguy cấp — dải quyết định giá trị sử dụng — vẫn giữ được 0,792 (mục 7.2).</w:t>
       </w:r>
     </w:p>
     <w:p>
@@ -7078,7 +7326,7 @@
                 <w:sz w:val="20"/>
                 <w:szCs w:val="20"/>
               </w:rPr>
-              <w:t xml:space="preserve">0.0</w:t>
+              <w:t xml:space="preserve">0,0</w:t>
             </w:r>
           </w:p>
         </w:tc>
@@ -7106,7 +7354,7 @@
                 <w:sz w:val="20"/>
                 <w:szCs w:val="20"/>
               </w:rPr>
-              <w:t xml:space="preserve">0.671</w:t>
+              <w:t xml:space="preserve">0,557</w:t>
             </w:r>
           </w:p>
         </w:tc>
@@ -7134,7 +7382,7 @@
                 <w:sz w:val="20"/>
                 <w:szCs w:val="20"/>
               </w:rPr>
-              <w:t xml:space="preserve">0.681</w:t>
+              <w:t xml:space="preserve">0,612</w:t>
             </w:r>
           </w:p>
         </w:tc>
@@ -7162,7 +7410,7 @@
                 <w:sz w:val="20"/>
                 <w:szCs w:val="20"/>
               </w:rPr>
-              <w:t xml:space="preserve">0.676</w:t>
+              <w:t xml:space="preserve">0,583</w:t>
             </w:r>
           </w:p>
         </w:tc>
@@ -7190,7 +7438,7 @@
                 <w:sz w:val="20"/>
                 <w:szCs w:val="20"/>
               </w:rPr>
-              <w:t xml:space="preserve">0.309</w:t>
+              <w:t xml:space="preserve">0,297</w:t>
             </w:r>
           </w:p>
         </w:tc>
@@ -7218,7 +7466,7 @@
                 <w:sz w:val="20"/>
                 <w:szCs w:val="20"/>
               </w:rPr>
-              <w:t xml:space="preserve">0.983</w:t>
+              <w:t xml:space="preserve">0,983</w:t>
             </w:r>
           </w:p>
         </w:tc>
@@ -7251,7 +7499,7 @@
                 <w:sz w:val="20"/>
                 <w:szCs w:val="20"/>
               </w:rPr>
-              <w:t xml:space="preserve">1.0</w:t>
+              <w:t xml:space="preserve">1,0</w:t>
             </w:r>
           </w:p>
         </w:tc>
@@ -7279,7 +7527,7 @@
                 <w:sz w:val="20"/>
                 <w:szCs w:val="20"/>
               </w:rPr>
-              <w:t xml:space="preserve">0.568</w:t>
+              <w:t xml:space="preserve">0,515</w:t>
             </w:r>
           </w:p>
         </w:tc>
@@ -7307,7 +7555,7 @@
                 <w:sz w:val="20"/>
                 <w:szCs w:val="20"/>
               </w:rPr>
-              <w:t xml:space="preserve">0.667</w:t>
+              <w:t xml:space="preserve">0,559</w:t>
             </w:r>
           </w:p>
         </w:tc>
@@ -7335,7 +7583,7 @@
                 <w:sz w:val="20"/>
                 <w:szCs w:val="20"/>
               </w:rPr>
-              <w:t xml:space="preserve">0.613</w:t>
+              <w:t xml:space="preserve">0,536</w:t>
             </w:r>
           </w:p>
         </w:tc>
@@ -7363,7 +7611,7 @@
                 <w:sz w:val="20"/>
                 <w:szCs w:val="20"/>
               </w:rPr>
-              <w:t xml:space="preserve">0.315</w:t>
+              <w:t xml:space="preserve">0,310</w:t>
             </w:r>
           </w:p>
         </w:tc>
@@ -7391,7 +7639,7 @@
                 <w:sz w:val="20"/>
                 <w:szCs w:val="20"/>
               </w:rPr>
-              <w:t xml:space="preserve">0.983</w:t>
+              <w:t xml:space="preserve">0,983</w:t>
             </w:r>
           </w:p>
         </w:tc>
@@ -7424,7 +7672,7 @@
                 <w:sz w:val="20"/>
                 <w:szCs w:val="20"/>
               </w:rPr>
-              <w:t xml:space="preserve">2.0</w:t>
+              <w:t xml:space="preserve">2,0</w:t>
             </w:r>
           </w:p>
         </w:tc>
@@ -7452,7 +7700,7 @@
                 <w:sz w:val="20"/>
                 <w:szCs w:val="20"/>
               </w:rPr>
-              <w:t xml:space="preserve">0.489</w:t>
+              <w:t xml:space="preserve">0,450</w:t>
             </w:r>
           </w:p>
         </w:tc>
@@ -7480,7 +7728,7 @@
                 <w:sz w:val="20"/>
                 <w:szCs w:val="20"/>
               </w:rPr>
-              <w:t xml:space="preserve">0.652</w:t>
+              <w:t xml:space="preserve">0,566</w:t>
             </w:r>
           </w:p>
         </w:tc>
@@ -7508,7 +7756,7 @@
                 <w:sz w:val="20"/>
                 <w:szCs w:val="20"/>
               </w:rPr>
-              <w:t xml:space="preserve">0.559</w:t>
+              <w:t xml:space="preserve">0,501</w:t>
             </w:r>
           </w:p>
         </w:tc>
@@ -7536,7 +7784,7 @@
                 <w:sz w:val="20"/>
                 <w:szCs w:val="20"/>
               </w:rPr>
-              <w:t xml:space="preserve">0.284</w:t>
+              <w:t xml:space="preserve">0,290</w:t>
             </w:r>
           </w:p>
         </w:tc>
@@ -7564,7 +7812,7 @@
                 <w:sz w:val="20"/>
                 <w:szCs w:val="20"/>
               </w:rPr>
-              <w:t xml:space="preserve">0.983</w:t>
+              <w:t xml:space="preserve">0,983</w:t>
             </w:r>
           </w:p>
         </w:tc>
@@ -7597,7 +7845,7 @@
                 <w:sz w:val="20"/>
                 <w:szCs w:val="20"/>
               </w:rPr>
-              <w:t xml:space="preserve">4.0</w:t>
+              <w:t xml:space="preserve">4,0</w:t>
             </w:r>
           </w:p>
         </w:tc>
@@ -7625,7 +7873,7 @@
                 <w:sz w:val="20"/>
                 <w:szCs w:val="20"/>
               </w:rPr>
-              <w:t xml:space="preserve">0.375</w:t>
+              <w:t xml:space="preserve">0,332</w:t>
             </w:r>
           </w:p>
         </w:tc>
@@ -7653,7 +7901,7 @@
                 <w:sz w:val="20"/>
                 <w:szCs w:val="20"/>
               </w:rPr>
-              <w:t xml:space="preserve">0.696</w:t>
+              <w:t xml:space="preserve">0,559</w:t>
             </w:r>
           </w:p>
         </w:tc>
@@ -7681,7 +7929,7 @@
                 <w:sz w:val="20"/>
                 <w:szCs w:val="20"/>
               </w:rPr>
-              <w:t xml:space="preserve">0.487</w:t>
+              <w:t xml:space="preserve">0,417</w:t>
             </w:r>
           </w:p>
         </w:tc>
@@ -7709,7 +7957,7 @@
                 <w:sz w:val="20"/>
                 <w:szCs w:val="20"/>
               </w:rPr>
-              <w:t xml:space="preserve">0.294</w:t>
+              <w:t xml:space="preserve">0,301</w:t>
             </w:r>
           </w:p>
         </w:tc>
@@ -7737,7 +7985,7 @@
                 <w:sz w:val="20"/>
                 <w:szCs w:val="20"/>
               </w:rPr>
-              <w:t xml:space="preserve">0.983</w:t>
+              <w:t xml:space="preserve">0,982</w:t>
             </w:r>
           </w:p>
         </w:tc>
@@ -7770,7 +8018,7 @@
                 <w:sz w:val="20"/>
                 <w:szCs w:val="20"/>
               </w:rPr>
-              <w:t xml:space="preserve">6.0</w:t>
+              <w:t xml:space="preserve">6,0</w:t>
             </w:r>
           </w:p>
         </w:tc>
@@ -7798,7 +8046,7 @@
                 <w:sz w:val="20"/>
                 <w:szCs w:val="20"/>
               </w:rPr>
-              <w:t xml:space="preserve">0.169</w:t>
+              <w:t xml:space="preserve">0,233</w:t>
             </w:r>
           </w:p>
         </w:tc>
@@ -7826,7 +8074,7 @@
                 <w:sz w:val="20"/>
                 <w:szCs w:val="20"/>
               </w:rPr>
-              <w:t xml:space="preserve">0.638</w:t>
+              <w:t xml:space="preserve">0,566</w:t>
             </w:r>
           </w:p>
         </w:tc>
@@ -7854,7 +8102,7 @@
                 <w:sz w:val="20"/>
                 <w:szCs w:val="20"/>
               </w:rPr>
-              <w:t xml:space="preserve">0.268</w:t>
+              <w:t xml:space="preserve">0,330</w:t>
             </w:r>
           </w:p>
         </w:tc>
@@ -7882,7 +8130,7 @@
                 <w:sz w:val="20"/>
                 <w:szCs w:val="20"/>
               </w:rPr>
-              <w:t xml:space="preserve">0.281</w:t>
+              <w:t xml:space="preserve">0,328</w:t>
             </w:r>
           </w:p>
         </w:tc>
@@ -7910,7 +8158,7 @@
                 <w:sz w:val="20"/>
                 <w:szCs w:val="20"/>
               </w:rPr>
-              <w:t xml:space="preserve">0.979</w:t>
+              <w:t xml:space="preserve">0,976</w:t>
             </w:r>
           </w:p>
         </w:tc>
@@ -7927,7 +8175,7 @@
           <w:sz w:val="24"/>
           <w:szCs w:val="24"/>
         </w:rPr>
-        <w:t xml:space="preserve">Tracking gần như không suy giảm cho tới mức nhiễu 6 px (IDF1 vẫn 0,98) nhờ cơ chế nới biên bbox khi ghép. Precision là thành phần nhạy cảm nhất — giảm từ 0,67 xuống 0,17 khi nhiễu tăng từ 0 lên 6 px, cho thấy chất lượng detector là nút thắt chính của toàn hệ thống.</w:t>
+        <w:t xml:space="preserve">Tracking gần như không suy giảm cho tới mức nhiễu 6 px (IDF1 vẫn 0,98) nhờ cơ chế nới biên bbox khi ghép. Precision là thành phần nhạy cảm nhất — giảm từ 0,557 xuống 0,233 khi nhiễu tăng từ 0 lên 6 px, cho thấy chất lượng detector là nút thắt chính của toàn hệ thống.</w:t>
       </w:r>
     </w:p>
     <w:p>
@@ -8047,7 +8295,7 @@
           <w:sz w:val="24"/>
           <w:szCs w:val="24"/>
         </w:rPr>
-        <w:t xml:space="preserve">Hai chỉ số chưa đạt mục tiêu đề ra: Conflict Precision (0,51 so với mục tiêu 0,75) và Conflict Recall gộp (0,64 so với mục tiêu 0,80). Chúng tôi báo cáo nguyên trạng và phân tích nguyên nhân thay vì điều chỉnh ngưỡng cho số liệu đẹp hơn.</w:t>
+        <w:t xml:space="preserve">Hai chỉ số chưa đạt mục tiêu đề ra: Conflict Precision (0,471 so với mục tiêu 0,75) và Conflict Recall gộp (0,539 so với mục tiêu 0,80). Chúng tôi báo cáo nguyên trạng và phân tích nguyên nhân thay vì điều chỉnh ngưỡng cho số liệu đẹp hơn.</w:t>
       </w:r>
     </w:p>
     <w:p>
@@ -8083,7 +8331,7 @@
           <w:sz w:val="24"/>
           <w:szCs w:val="24"/>
         </w:rPr>
-        <w:t xml:space="preserve">Trần của thuật toán. Với detector hoàn hảo (nhiễu 0 px), hệ thống đạt F1 = 0,65. Nghĩa là khoảng 0,10 điểm F1 mất do nhiễu detector, phần còn lại là giới hạn của chính phương pháp.</w:t>
+        <w:t xml:space="preserve">Trần của thuật toán. Với detector hoàn hảo (nhiễu 0 px), hệ thống đạt F1 = 0,583. Nghĩa là khoảng 0,08 điểm F1 mất do nhiễu detector, phần còn lại là giới hạn của chính phương pháp.</w:t>
       </w:r>
     </w:p>
     <w:p>
@@ -8121,7 +8369,7 @@
           <w:sz w:val="24"/>
           <w:szCs w:val="24"/>
         </w:rPr>
-        <w:t xml:space="preserve">Độ chính xác phân loại kiểu xung đột chỉ đạt 0,50, do góc tiếp cận được ước lượng từ vận tốc vốn đã có nhiễu.</w:t>
+        <w:t xml:space="preserve">Độ chính xác phân loại kiểu xung đột chỉ đạt 0,598, do góc tiếp cận được ước lượng từ vận tốc vốn đã có nhiễu.</w:t>
       </w:r>
     </w:p>
     <w:p>
@@ -8152,7 +8400,7 @@
           <w:sz w:val="24"/>
           <w:szCs w:val="24"/>
         </w:rPr>
-        <w:t xml:space="preserve">Với mục đích thực tế của hệ thống — xếp hạng mức nguy hiểm giữa các giao lộ và chỉ ra điểm nóng cần ưu tiên — thì chỉ số quan trọng là Recall ở dải nguy cấp, và con số đó đạt 0.824. Các cảnh báo ở ranh giới có thể được lọc bằng ngưỡng Risk Score khi vận hành thực tế, vì thang điểm đã được hiệu chỉnh để phân biệt tốt.</w:t>
+        <w:t xml:space="preserve">Với mục đích thực tế của hệ thống — xếp hạng mức nguy hiểm giữa các giao lộ và chỉ ra điểm nóng cần ưu tiên — thì chỉ số quan trọng là Recall ở dải nguy cấp, và con số đó đạt 0,792. Các cảnh báo ở ranh giới có thể được lọc bằng ngưỡng Risk Score khi vận hành thực tế, vì thang điểm đã được hiệu chỉnh để phân biệt tốt.</w:t>
       </w:r>
     </w:p>
     <w:p>
@@ -9654,7 +9902,7 @@
                 <w:sz w:val="20"/>
                 <w:szCs w:val="20"/>
               </w:rPr>
-              <w:t xml:space="preserve">tests/ — 78 test, chạy bằng pytest</w:t>
+              <w:t xml:space="preserve">tests/ — 81 test, chạy bằng pytest</w:t>
             </w:r>
           </w:p>
         </w:tc>

</xml_diff>

<commit_message>
fix: đo lại trên dữ liệu thật và tốc độ có YOLO; tách nhãn chạm; thêm CI và bản trình diễn tĩnh
- evaluate-real: Precision/Recall ở ngưỡng vận hành, MOTA không kẹp về 0,
  JSON không còn NaN, ghi hệ điều hành và phiên bản thư viện lúc chạy
- evaluate: tách Recall cho nhãn có thân xe chồng lên nhau (TTC = 0)
- configs MVTI và Hàng Xanh về detector một lượt: chia ô cho mAP thấp hơn
  (0,164 so với 0,208) và chậm khoảng 9 lần; kết quả chia ô lưu riêng
- tốc độ toàn hệ thống có YOLO trên CPU 2 lõi: 12,1 FPS; dashboard ghi rõ
  khi FPS dùng hộp phát hiện dựng sẵn (không gồm YOLO)
- GitHub Actions chạy bộ kiểm thử; dựng site tĩnh cho Vercel (vercel.json)
- đọc bundle pickle giữa Windows và Linux; ghi video H.264 khi có codec
- 91 test; tài liệu cập nhật theo tệp kết quả mới, thay gạch dài bằng gạch ngắn
</commit_message>
<xml_diff>
--- a/docs/BaoCao_SafeRoadAI_BangC.docx
+++ b/docs/BaoCao_SafeRoadAI_BangC.docx
@@ -33,7 +33,7 @@
           <w:sz w:val="26"/>
           <w:szCs w:val="26"/>
         </w:rPr>
-        <w:t xml:space="preserve">TRONG LĨNH VỰC TRÍ TUỆ NHÂN TẠO NĂM 2026 — BẢNG C</w:t>
+        <w:t xml:space="preserve">TRONG LĨNH VỰC TRÍ TUỆ NHÂN TẠO NĂM 2026 - BẢNG C</w:t>
       </w:r>
     </w:p>
     <w:p>
@@ -205,7 +205,7 @@
                 <w:sz w:val="22"/>
                 <w:szCs w:val="22"/>
               </w:rPr>
-              <w:t xml:space="preserve">SafeRoad AI — Phát hiện xung đột giao thông &amp; bản đồ rủi ro va chạm</w:t>
+              <w:t xml:space="preserve">SafeRoad AI - Phát hiện xung đột giao thông &amp; bản đồ rủi ro va chạm</w:t>
             </w:r>
           </w:p>
         </w:tc>
@@ -266,7 +266,7 @@
                 <w:sz w:val="22"/>
                 <w:szCs w:val="22"/>
               </w:rPr>
-              <w:t xml:space="preserve">Bảng C — đội thi tự do</w:t>
+              <w:t xml:space="preserve">Bảng C - đội thi tự do</w:t>
             </w:r>
           </w:p>
         </w:tc>
@@ -388,7 +388,7 @@
                 <w:sz w:val="22"/>
                 <w:szCs w:val="22"/>
               </w:rPr>
-              <w:t xml:space="preserve">Mạnh Anh (Robot) · Huynh Hân (QTKD)</w:t>
+              <w:t xml:space="preserve">Lại Thế Mạnh Anh (Kỹ thuật Robot) · Trần Huỳnh Hân (Quản trị Kinh doanh)</w:t>
             </w:r>
           </w:p>
         </w:tc>
@@ -702,7 +702,7 @@
           <w:sz w:val="24"/>
           <w:szCs w:val="24"/>
         </w:rPr>
-        <w:t xml:space="preserve">Sinh bản đồ rủi ro không–thời gian, chỉ ra các điểm nóng cần ưu tiên xử lý hạ tầng.</w:t>
+        <w:t xml:space="preserve">Sinh bản đồ rủi ro không-thời gian, chỉ ra các điểm nóng cần ưu tiên xử lý hạ tầng.</w:t>
       </w:r>
     </w:p>
     <w:p>
@@ -1138,7 +1138,7 @@
           <w:sz w:val="24"/>
           <w:szCs w:val="24"/>
         </w:rPr>
-        <w:t xml:space="preserve">Hệ thống nhận luồng video từ camera giao lộ đặt cao 10–18 m và xử lý qua sáu khối nối tiếp. Toàn bộ pipeline chạy trên một máy duy nhất, không phụ thuộc dịch vụ đám mây.</w:t>
+        <w:t xml:space="preserve">Hệ thống nhận luồng video từ camera giao lộ đặt cao 10-18 m và xử lý qua sáu khối nối tiếp. Toàn bộ pipeline chạy trên một máy duy nhất, không phụ thuộc dịch vụ đám mây.</w:t>
       </w:r>
     </w:p>
     <w:p>
@@ -1665,7 +1665,7 @@
                 <w:sz w:val="20"/>
                 <w:szCs w:val="20"/>
               </w:rPr>
-              <w:t xml:space="preserve">Sigmoid có trọng số · lưới không–thời gian</w:t>
+              <w:t xml:space="preserve">Sigmoid có trọng số · lưới không-thời gian</w:t>
             </w:r>
           </w:p>
         </w:tc>
@@ -2393,7 +2393,7 @@
           <w:sz w:val="24"/>
           <w:szCs w:val="24"/>
         </w:rPr>
-        <w:t xml:space="preserve">Không một dataset giao thông công khai nào có nhãn near-miss — tất cả chỉ có bounding box. Mà Precision/Recall của phát hiện xung đột lại là cam kết trung tâm của đề tài. Trình mô phỏng cho phép biết chính xác quỹ đạo giải tích của từng xe, nhờ đó tính được TTC/PET thật ở độ phân giải thời gian tuỳ ý và có một tập nhãn chuẩn để chấm điểm.</w:t>
+        <w:t xml:space="preserve">Không một dataset giao thông công khai nào có nhãn near-miss - tất cả chỉ có bounding box. Mà Precision/Recall của phát hiện xung đột lại là cam kết trung tâm của đề tài. Trình mô phỏng cho phép biết chính xác quỹ đạo giải tích của từng xe, nhờ đó tính được TTC/PET thật ở độ phân giải thời gian tuỳ ý và có một tập nhãn chuẩn để chấm điểm.</w:t>
       </w:r>
     </w:p>
     <w:p>
@@ -2427,7 +2427,7 @@
           <w:sz w:val="22"/>
           <w:szCs w:val="22"/>
         </w:rPr>
-        <w:t xml:space="preserve">Trong trình mô phỏng, near-miss phát sinh từ đúng nguyên nhân ngoài đời — xe vượt đèn đỏ, xe rẽ cắt dòng ngược chiều, người đi bộ băng qua đường — chứ không có tình huống nào được dàn dựng thủ công.</w:t>
+        <w:t xml:space="preserve">Trong trình mô phỏng, near-miss phát sinh từ đúng nguyên nhân ngoài đời - xe vượt đèn đỏ, xe rẽ cắt dòng ngược chiều, người đi bộ băng qua đường - chứ không có tình huống nào được dàn dựng thủ công.</w:t>
       </w:r>
     </w:p>
     <w:p>
@@ -2482,7 +2482,7 @@
           <w:sz w:val="24"/>
           <w:szCs w:val="24"/>
         </w:rPr>
-        <w:t xml:space="preserve">Bước ẩn danh chạy ngay sau detection, trước mọi thao tác ghi ra đĩa — mọi dữ liệu lưu trữ từ đó trở đi đều đã ẩn danh.</w:t>
+        <w:t xml:space="preserve">Bước ẩn danh chạy ngay sau detection, trước mọi thao tác ghi ra đĩa - mọi dữ liệu lưu trữ từ đó trở đi đều đã ẩn danh.</w:t>
       </w:r>
     </w:p>
     <w:p>
@@ -2559,7 +2559,7 @@
           <w:sz w:val="26"/>
           <w:szCs w:val="26"/>
         </w:rPr>
-        <w:t xml:space="preserve">6.1. TTC — Time To Collision</w:t>
+        <w:t xml:space="preserve">6.1. TTC - Time To Collision</w:t>
       </w:r>
     </w:p>
     <w:p>
@@ -2619,7 +2619,7 @@
           <w:sz w:val="24"/>
           <w:szCs w:val="24"/>
         </w:rPr>
-        <w:t xml:space="preserve">Cải tiến quan trọng — mô hình đa hình tròn. </w:t>
+        <w:t xml:space="preserve">Cải tiến quan trọng - mô hình đa hình tròn. </w:t>
       </w:r>
       <w:r>
         <w:rPr>
@@ -2627,7 +2627,7 @@
           <w:sz w:val="24"/>
           <w:szCs w:val="24"/>
         </w:rPr>
-        <w:t xml:space="preserve">Cách làm phổ biến là xấp xỉ mỗi xe bằng một hình tròn ngoại tiếp. Với ô tô 4,4 × 1,8 m, hình tròn đó có bán kính 2,38 m, tức là mô hình hoá chiếc xe như vật thể rộng 4,76 m. Hậu quả đo được trong quá trình phát triển: hai ô tô đi ngược chiều ở hai làn cách nhau 4 m bị gắn nhãn "đối đầu", sinh ra 132 cảnh báo giả trong 120 giây cho dòng xe hoàn toàn bình thường. Chúng tôi thay bằng cách phủ thân xe bằng 1–3 hình tròn nhỏ dọc trục, bán kính bằng nửa bề rộng xe; số cảnh báo giả loại này giảm xuống còn 13.</w:t>
+        <w:t xml:space="preserve">Cách làm phổ biến là xấp xỉ mỗi xe bằng một hình tròn ngoại tiếp. Với ô tô 4,4 × 1,8 m, hình tròn đó có bán kính 2,38 m, tức là mô hình hoá chiếc xe như vật thể rộng 4,76 m. Hậu quả đo được trong quá trình phát triển: hai ô tô đi ngược chiều ở hai làn cách nhau 4 m bị gắn nhãn "đối đầu", sinh ra 132 cảnh báo giả trong 120 giây cho dòng xe hoàn toàn bình thường. Chúng tôi thay bằng cách phủ thân xe bằng 1-3 hình tròn nhỏ dọc trục, bán kính bằng nửa bề rộng xe; số cảnh báo giả loại này giảm xuống còn 13.</w:t>
       </w:r>
     </w:p>
     <w:p>
@@ -2644,7 +2644,7 @@
           <w:sz w:val="26"/>
           <w:szCs w:val="26"/>
         </w:rPr>
-        <w:t xml:space="preserve">6.2. PET — Post-Encroachment Time</w:t>
+        <w:t xml:space="preserve">6.2. PET - Post-Encroachment Time</w:t>
       </w:r>
     </w:p>
     <w:p>
@@ -2658,7 +2658,7 @@
           <w:sz w:val="24"/>
           <w:szCs w:val="24"/>
         </w:rPr>
-        <w:t xml:space="preserve">PET là khoảng thời gian giữa lúc đối tượng thứ nhất rời khỏi điểm xung đột và lúc đối tượng thứ hai đi tới chính điểm đó. Chỉ số này bắt được tình huống mà TTC bỏ sót: xe A vừa qua, 0,8 giây sau xe B mới tới đúng chỗ đó — chưa từng có nguy cơ va chạm tức thời nhưng rõ ràng là "suýt".</w:t>
+        <w:t xml:space="preserve">PET là khoảng thời gian giữa lúc đối tượng thứ nhất rời khỏi điểm xung đột và lúc đối tượng thứ hai đi tới chính điểm đó. Chỉ số này bắt được tình huống mà TTC bỏ sót: xe A vừa qua, 0,8 giây sau xe B mới tới đúng chỗ đó - chưa từng có nguy cơ va chạm tức thời nhưng rõ ràng là "suýt".</w:t>
       </w:r>
     </w:p>
     <w:p>
@@ -2678,7 +2678,7 @@
           <w:sz w:val="22"/>
           <w:szCs w:val="22"/>
         </w:rPr>
-        <w:t xml:space="preserve">PET chỉ được tính khi góc giữa hai quỹ đạo ≥ 20°. Với hai xe đi gần song song, giao điểm hai tia nằm rất xa và cực nhạy với nhiễu — lệch hướng 1° đã dời giao điểm hàng chục mét, sinh ra giá trị PET nhỏ hoàn toàn giả.</w:t>
+        <w:t xml:space="preserve">PET chỉ được tính khi góc giữa hai quỹ đạo ≥ 20°. Với hai xe đi gần song song, giao điểm hai tia nằm rất xa và cực nhạy với nhiễu - lệch hướng 1° đã dời giao điểm hàng chục mét, sinh ra giá trị PET nhỏ hoàn toàn giả.</w:t>
       </w:r>
     </w:p>
     <w:p>
@@ -3389,7 +3389,7 @@
           <w:sz w:val="24"/>
           <w:szCs w:val="24"/>
         </w:rPr>
-        <w:t xml:space="preserve">Dùng nghịch đảo TTC và PET vì mức nguy hiểm không tuyến tính theo thời gian còn lại: chênh lệch giữa 0,5 s và 1,0 s nghiêm trọng hơn rất nhiều so với chênh lệch giữa 4,0 s và 4,5 s. Hàm sigmoid giữ kết quả nằm gọn trong khoảng 0–100.</w:t>
+        <w:t xml:space="preserve">Dùng nghịch đảo TTC và PET vì mức nguy hiểm không tuyến tính theo thời gian còn lại: chênh lệch giữa 0,5 s và 1,0 s nghiêm trọng hơn rất nhiều so với chênh lệch giữa 4,0 s và 4,5 s. Hàm sigmoid giữ kết quả nằm gọn trong khoảng 0-100.</w:t>
       </w:r>
     </w:p>
     <w:p>
@@ -3403,7 +3403,7 @@
           <w:sz w:val="24"/>
           <w:szCs w:val="24"/>
         </w:rPr>
-        <w:t xml:space="preserve">Từng số hạng được lưu riêng, nhờ đó dashboard giải thích được vì sao một cảnh báo có mức rủi ro cao — đây chính là yêu cầu Explainable Risk. Bộ trọng số được hiệu chỉnh trên tập có nhãn để phân bố điểm trải đều; bộ chưa hiệu chỉnh đẩy trung vị lên 98/100, khi mọi cảnh báo đều "rất nguy hiểm" thì thang điểm không còn phân biệt được gì và người vận hành sẽ bỏ qua tất cả. Sau hiệu chỉnh, phân bố trên 214 cảnh báo đạt phân vị 10 = 20, trung vị = 63, phân vị 90 = 90.</w:t>
+        <w:t xml:space="preserve">Từng số hạng được lưu riêng, nhờ đó dashboard giải thích được vì sao một cảnh báo có mức rủi ro cao - đây chính là yêu cầu Explainable Risk. Bộ trọng số được hiệu chỉnh trên tập có nhãn để phân bố điểm trải đều; bộ chưa hiệu chỉnh đẩy trung vị lên 98/100, khi mọi cảnh báo đều "rất nguy hiểm" thì thang điểm không còn phân biệt được gì và người vận hành sẽ bỏ qua tất cả. Sau hiệu chỉnh, phân bố trên 214 cảnh báo đạt phân vị 10 = 20, trung vị = 63, phân vị 90 = 90.</w:t>
       </w:r>
     </w:p>
     <w:p>
@@ -4034,7 +4034,7 @@
                 <w:sz w:val="20"/>
                 <w:szCs w:val="20"/>
               </w:rPr>
-              <w:t xml:space="preserve">—</w:t>
+              <w:t xml:space="preserve">-</w:t>
             </w:r>
           </w:p>
         </w:tc>
@@ -4062,7 +4062,7 @@
                 <w:sz w:val="20"/>
                 <w:szCs w:val="20"/>
               </w:rPr>
-              <w:t xml:space="preserve">—</w:t>
+              <w:t xml:space="preserve">Kém</w:t>
             </w:r>
           </w:p>
         </w:tc>
@@ -4151,7 +4151,7 @@
                 <w:sz w:val="20"/>
                 <w:szCs w:val="20"/>
               </w:rPr>
-              <w:t xml:space="preserve">—</w:t>
+              <w:t xml:space="preserve">-</w:t>
             </w:r>
           </w:p>
         </w:tc>
@@ -4179,7 +4179,7 @@
                 <w:sz w:val="20"/>
                 <w:szCs w:val="20"/>
               </w:rPr>
-              <w:t xml:space="preserve">Rất tốt</w:t>
+              <w:t xml:space="preserve">Tốt</w:t>
             </w:r>
           </w:p>
         </w:tc>
@@ -4212,7 +4212,7 @@
                 <w:sz w:val="20"/>
                 <w:szCs w:val="20"/>
               </w:rPr>
-              <w:t xml:space="preserve">Conflict Recall (gộp)</w:t>
+              <w:t xml:space="preserve">Recall (TTC &lt; 1,0 s), chỉ 22 nhãn chưa chạm</w:t>
             </w:r>
           </w:p>
         </w:tc>
@@ -4240,7 +4240,7 @@
                 <w:sz w:val="20"/>
                 <w:szCs w:val="20"/>
               </w:rPr>
-              <w:t xml:space="preserve">0,539</w:t>
+              <w:t xml:space="preserve">0,773</w:t>
             </w:r>
           </w:p>
         </w:tc>
@@ -4268,7 +4268,7 @@
                 <w:sz w:val="20"/>
                 <w:szCs w:val="20"/>
               </w:rPr>
-              <w:t xml:space="preserve">≥ 0,80</w:t>
+              <w:t xml:space="preserve">-</w:t>
             </w:r>
           </w:p>
         </w:tc>
@@ -4296,7 +4296,7 @@
                 <w:sz w:val="20"/>
                 <w:szCs w:val="20"/>
               </w:rPr>
-              <w:t xml:space="preserve">Chưa đạt</w:t>
+              <w:t xml:space="preserve">Tốt</w:t>
             </w:r>
           </w:p>
         </w:tc>
@@ -4329,7 +4329,7 @@
                 <w:sz w:val="20"/>
                 <w:szCs w:val="20"/>
               </w:rPr>
-              <w:t xml:space="preserve">Conflict Precision</w:t>
+              <w:t xml:space="preserve">Conflict Recall (gộp)</w:t>
             </w:r>
           </w:p>
         </w:tc>
@@ -4357,7 +4357,7 @@
                 <w:sz w:val="20"/>
                 <w:szCs w:val="20"/>
               </w:rPr>
-              <w:t xml:space="preserve">0,471</w:t>
+              <w:t xml:space="preserve">0,539</w:t>
             </w:r>
           </w:p>
         </w:tc>
@@ -4385,7 +4385,7 @@
                 <w:sz w:val="20"/>
                 <w:szCs w:val="20"/>
               </w:rPr>
-              <w:t xml:space="preserve">≥ 0,75</w:t>
+              <w:t xml:space="preserve">≥ 0,80</w:t>
             </w:r>
           </w:p>
         </w:tc>
@@ -4446,7 +4446,7 @@
                 <w:sz w:val="20"/>
                 <w:szCs w:val="20"/>
               </w:rPr>
-              <w:t xml:space="preserve">Tốc độ xử lý (kèm ghi overlay)</w:t>
+              <w:t xml:space="preserve">Conflict Precision</w:t>
             </w:r>
           </w:p>
         </w:tc>
@@ -4474,7 +4474,7 @@
                 <w:sz w:val="20"/>
                 <w:szCs w:val="20"/>
               </w:rPr>
-              <w:t xml:space="preserve">39,0 FPS</w:t>
+              <w:t xml:space="preserve">0,471</w:t>
             </w:r>
           </w:p>
         </w:tc>
@@ -4502,7 +4502,7 @@
                 <w:sz w:val="20"/>
                 <w:szCs w:val="20"/>
               </w:rPr>
-              <w:t xml:space="preserve">≥ 25 FPS</w:t>
+              <w:t xml:space="preserve">≥ 0,75</w:t>
             </w:r>
           </w:p>
         </w:tc>
@@ -4530,7 +4530,7 @@
                 <w:sz w:val="20"/>
                 <w:szCs w:val="20"/>
               </w:rPr>
-              <w:t xml:space="preserve">Đạt</w:t>
+              <w:t xml:space="preserve">Chưa đạt</w:t>
             </w:r>
           </w:p>
         </w:tc>
@@ -4563,7 +4563,7 @@
                 <w:sz w:val="20"/>
                 <w:szCs w:val="20"/>
               </w:rPr>
-              <w:t xml:space="preserve">Tốc độ lõi phân tích</w:t>
+              <w:t xml:space="preserve">Tốc độ toàn hệ thống có YOLO (MVTI, CPU 2 lõi)</w:t>
             </w:r>
           </w:p>
         </w:tc>
@@ -4591,7 +4591,7 @@
                 <w:sz w:val="20"/>
                 <w:szCs w:val="20"/>
               </w:rPr>
-              <w:t xml:space="preserve">141 FPS</w:t>
+              <w:t xml:space="preserve">12,1 FPS</w:t>
             </w:r>
           </w:p>
         </w:tc>
@@ -4647,7 +4647,7 @@
                 <w:sz w:val="20"/>
                 <w:szCs w:val="20"/>
               </w:rPr>
-              <w:t xml:space="preserve">Đạt</w:t>
+              <w:t xml:space="preserve">Chưa đạt</w:t>
             </w:r>
           </w:p>
         </w:tc>
@@ -4680,7 +4680,7 @@
                 <w:sz w:val="20"/>
                 <w:szCs w:val="20"/>
               </w:rPr>
-              <w:t xml:space="preserve">Độ trễ trung vị</w:t>
+              <w:t xml:space="preserve">Độ trễ xử lý mỗi khung hình (trung vị / p95)</w:t>
             </w:r>
           </w:p>
         </w:tc>
@@ -4708,7 +4708,7 @@
                 <w:sz w:val="20"/>
                 <w:szCs w:val="20"/>
               </w:rPr>
-              <w:t xml:space="preserve">25,7 ms/frame</w:t>
+              <w:t xml:space="preserve">82,4 / 93,4 ms</w:t>
             </w:r>
           </w:p>
         </w:tc>
@@ -4797,7 +4797,7 @@
                 <w:sz w:val="20"/>
                 <w:szCs w:val="20"/>
               </w:rPr>
-              <w:t xml:space="preserve">Độ trễ p95</w:t>
+              <w:t xml:space="preserve">Thời gian các khâu sau phát hiện</w:t>
             </w:r>
           </w:p>
         </w:tc>
@@ -4825,7 +4825,7 @@
                 <w:sz w:val="20"/>
                 <w:szCs w:val="20"/>
               </w:rPr>
-              <w:t xml:space="preserve">34,0 ms/frame</w:t>
+              <w:t xml:space="preserve">0,7 ms/khung</w:t>
             </w:r>
           </w:p>
         </w:tc>
@@ -4853,7 +4853,7 @@
                 <w:sz w:val="20"/>
                 <w:szCs w:val="20"/>
               </w:rPr>
-              <w:t xml:space="preserve">≤ 1,5 s</w:t>
+              <w:t xml:space="preserve">-</w:t>
             </w:r>
           </w:p>
         </w:tc>
@@ -4881,7 +4881,7 @@
                 <w:sz w:val="20"/>
                 <w:szCs w:val="20"/>
               </w:rPr>
-              <w:t xml:space="preserve">Đạt</w:t>
+              <w:t xml:space="preserve">-</w:t>
             </w:r>
           </w:p>
         </w:tc>
@@ -4898,7 +4898,7 @@
           <w:sz w:val="24"/>
           <w:szCs w:val="24"/>
         </w:rPr>
-        <w:t xml:space="preserve">Hai con số tốc độ lệch nhau vì một lý do cần nói rõ: khâu vẽ và ghi video overlay chiếm 11,9 ms trong 18,8 ms tổng thời gian các khâu xử lý, tức 63% — phần lớn thời gian không dùng để phân tích mà để tạo video minh hoạ. (Trung vị đầu-cuối 25,7 ms ở bảng trên lớn hơn tổng này vì còn tính cả thời gian đọc và giải mã khung hình.) Overlay chỉ cần cho demo và kiểm tra bằng mắt; khi triển khai thật hệ thống chỉ xuất cảnh báo và số liệu, nên tốc độ thực tế là con số ở dòng thứ hai. Cả hai đều đo bằng trung vị độ trễ từng frame thay vì chia tổng thời gian chạy cho số frame — cách sau bị sai lệch hoàn toàn nếu máy đo ngủ, bị throttle nhiệt, hoặc có tiến trình khác giành CPU.</w:t>
+        <w:t xml:space="preserve">Tốc độ đo trên video thật MVTI với YOLO11n chạy trên CPU 2 lõi, không GPU: khâu phát hiện chiếm 81,2 ms trong 81,8 ms mỗi khung hình, còn theo vết, quỹ đạo và đo xung đột cộng lại chỉ 0,7 ms. Muốn đạt 25 khung hình/giây cần GPU cho khâu phát hiện. Các lần chạy trên video mô phỏng dùng hộp phát hiện dựng sẵn nên tốc độ của chúng (39,0 FPS khi có ghi video minh hoạ) không gồm thời gian chạy YOLO và không dùng làm tốc độ của hệ thống. Tốc độ đo bằng trung vị độ trễ từng khung hình thay vì chia tổng thời gian chạy cho số khung hình, vì cách sau sai lệch khi máy ngủ hoặc có tiến trình khác giành CPU.</w:t>
       </w:r>
     </w:p>
     <w:p>
@@ -5130,7 +5130,7 @@
                 <w:sz w:val="20"/>
                 <w:szCs w:val="20"/>
               </w:rPr>
-              <w:t xml:space="preserve">Rất nghiêm trọng (TTC&lt;1,0s)</w:t>
+              <w:t xml:space="preserve">Rất nghiêm trọng (TTC &lt; 1,0 s)</w:t>
             </w:r>
           </w:p>
         </w:tc>
@@ -5275,7 +5275,7 @@
                 <w:sz w:val="20"/>
                 <w:szCs w:val="20"/>
               </w:rPr>
-              <w:t xml:space="preserve">Nghiêm trọng (1,0-1,5s)</w:t>
+              <w:t xml:space="preserve">Nghiêm trọng (1,0-1,5 s)</w:t>
             </w:r>
           </w:p>
         </w:tc>
@@ -5420,7 +5420,7 @@
                 <w:sz w:val="20"/>
                 <w:szCs w:val="20"/>
               </w:rPr>
-              <w:t xml:space="preserve">Trung bình (1,5-2,5s)</w:t>
+              <w:t xml:space="preserve">Trung bình (1,5-2,5 s)</w:t>
             </w:r>
           </w:p>
         </w:tc>
@@ -5565,7 +5565,7 @@
                 <w:sz w:val="20"/>
                 <w:szCs w:val="20"/>
               </w:rPr>
-              <w:t xml:space="preserve">Nhẹ (2,5-3,0s)</w:t>
+              <w:t xml:space="preserve">Nhẹ (2,5-3,0 s)</w:t>
             </w:r>
           </w:p>
         </w:tc>
@@ -5683,6 +5683,626 @@
         </w:tc>
       </w:tr>
     </w:tbl>
+    <w:tbl>
+      <w:tblPr>
+        <w:tblW w:type="dxa" w:w="9072"/>
+        <w:tblBorders>
+          <w:top w:val="single" w:color="auto" w:sz="4"/>
+          <w:left w:val="single" w:color="auto" w:sz="4"/>
+          <w:bottom w:val="single" w:color="auto" w:sz="4"/>
+          <w:right w:val="single" w:color="auto" w:sz="4"/>
+          <w:insideH w:val="single" w:color="auto" w:sz="4"/>
+          <w:insideV w:val="single" w:color="auto" w:sz="4"/>
+        </w:tblBorders>
+      </w:tblPr>
+      <w:tblGrid>
+        <w:gridCol w:w="3360"/>
+        <w:gridCol w:w="1512"/>
+        <w:gridCol w:w="1512"/>
+        <w:gridCol w:w="1344"/>
+        <w:gridCol w:w="1344"/>
+      </w:tblGrid>
+      <w:tr>
+        <w:trPr>
+          <w:cantSplit/>
+          <w:tblHeader/>
+        </w:trPr>
+        <w:tc>
+          <w:tcPr>
+            <w:tcW w:type="dxa" w:w="3360"/>
+            <w:shd w:fill="1F4E79" w:val="clear"/>
+            <w:tcMar>
+              <w:top w:type="dxa" w:w="60"/>
+              <w:left w:type="dxa" w:w="90"/>
+              <w:bottom w:type="dxa" w:w="60"/>
+              <w:right w:type="dxa" w:w="90"/>
+            </w:tcMar>
+          </w:tcPr>
+          <w:p>
+            <w:pPr>
+              <w:spacing w:after="0" w:line="240"/>
+              <w:jc w:val="left"/>
+            </w:pPr>
+            <w:r>
+              <w:rPr>
+                <w:rFonts w:ascii="Times New Roman" w:cs="Times New Roman" w:eastAsia="Times New Roman" w:hAnsi="Times New Roman"/>
+                <w:b/>
+                <w:bCs/>
+                <w:color w:val="FFFFFF"/>
+                <w:sz w:val="20"/>
+                <w:szCs w:val="20"/>
+              </w:rPr>
+              <w:t xml:space="preserve">Tách dải theo trạng thái chạm</w:t>
+            </w:r>
+          </w:p>
+        </w:tc>
+        <w:tc>
+          <w:tcPr>
+            <w:tcW w:type="dxa" w:w="1512"/>
+            <w:shd w:fill="1F4E79" w:val="clear"/>
+            <w:tcMar>
+              <w:top w:type="dxa" w:w="60"/>
+              <w:left w:type="dxa" w:w="90"/>
+              <w:bottom w:type="dxa" w:w="60"/>
+              <w:right w:type="dxa" w:w="90"/>
+            </w:tcMar>
+          </w:tcPr>
+          <w:p>
+            <w:pPr>
+              <w:spacing w:after="0" w:line="240"/>
+              <w:jc w:val="center"/>
+            </w:pPr>
+            <w:r>
+              <w:rPr>
+                <w:rFonts w:ascii="Times New Roman" w:cs="Times New Roman" w:eastAsia="Times New Roman" w:hAnsi="Times New Roman"/>
+                <w:b/>
+                <w:bCs/>
+                <w:color w:val="FFFFFF"/>
+                <w:sz w:val="20"/>
+                <w:szCs w:val="20"/>
+              </w:rPr>
+              <w:t xml:space="preserve">Số nhãn chuẩn</w:t>
+            </w:r>
+          </w:p>
+        </w:tc>
+        <w:tc>
+          <w:tcPr>
+            <w:tcW w:type="dxa" w:w="1512"/>
+            <w:shd w:fill="1F4E79" w:val="clear"/>
+            <w:tcMar>
+              <w:top w:type="dxa" w:w="60"/>
+              <w:left w:type="dxa" w:w="90"/>
+              <w:bottom w:type="dxa" w:w="60"/>
+              <w:right w:type="dxa" w:w="90"/>
+            </w:tcMar>
+          </w:tcPr>
+          <w:p>
+            <w:pPr>
+              <w:spacing w:after="0" w:line="240"/>
+              <w:jc w:val="center"/>
+            </w:pPr>
+            <w:r>
+              <w:rPr>
+                <w:rFonts w:ascii="Times New Roman" w:cs="Times New Roman" w:eastAsia="Times New Roman" w:hAnsi="Times New Roman"/>
+                <w:b/>
+                <w:bCs/>
+                <w:color w:val="FFFFFF"/>
+                <w:sz w:val="20"/>
+                <w:szCs w:val="20"/>
+              </w:rPr>
+              <w:t xml:space="preserve">Phát hiện được</w:t>
+            </w:r>
+          </w:p>
+        </w:tc>
+        <w:tc>
+          <w:tcPr>
+            <w:tcW w:type="dxa" w:w="1344"/>
+            <w:shd w:fill="1F4E79" w:val="clear"/>
+            <w:tcMar>
+              <w:top w:type="dxa" w:w="60"/>
+              <w:left w:type="dxa" w:w="90"/>
+              <w:bottom w:type="dxa" w:w="60"/>
+              <w:right w:type="dxa" w:w="90"/>
+            </w:tcMar>
+          </w:tcPr>
+          <w:p>
+            <w:pPr>
+              <w:spacing w:after="0" w:line="240"/>
+              <w:jc w:val="center"/>
+            </w:pPr>
+            <w:r>
+              <w:rPr>
+                <w:rFonts w:ascii="Times New Roman" w:cs="Times New Roman" w:eastAsia="Times New Roman" w:hAnsi="Times New Roman"/>
+                <w:b/>
+                <w:bCs/>
+                <w:color w:val="FFFFFF"/>
+                <w:sz w:val="20"/>
+                <w:szCs w:val="20"/>
+              </w:rPr>
+              <w:t xml:space="preserve">Recall</w:t>
+            </w:r>
+          </w:p>
+        </w:tc>
+        <w:tc>
+          <w:tcPr>
+            <w:tcW w:type="dxa" w:w="1344"/>
+            <w:shd w:fill="1F4E79" w:val="clear"/>
+            <w:tcMar>
+              <w:top w:type="dxa" w:w="60"/>
+              <w:left w:type="dxa" w:w="90"/>
+              <w:bottom w:type="dxa" w:w="60"/>
+              <w:right w:type="dxa" w:w="90"/>
+            </w:tcMar>
+          </w:tcPr>
+          <w:p>
+            <w:pPr>
+              <w:spacing w:after="0" w:line="240"/>
+              <w:jc w:val="center"/>
+            </w:pPr>
+            <w:r>
+              <w:rPr>
+                <w:rFonts w:ascii="Times New Roman" w:cs="Times New Roman" w:eastAsia="Times New Roman" w:hAnsi="Times New Roman"/>
+                <w:b/>
+                <w:bCs/>
+                <w:color w:val="FFFFFF"/>
+                <w:sz w:val="20"/>
+                <w:szCs w:val="20"/>
+              </w:rPr>
+              <w:t xml:space="preserve">TTC MAE</w:t>
+            </w:r>
+          </w:p>
+        </w:tc>
+      </w:tr>
+      <w:tr>
+        <w:trPr>
+          <w:cantSplit/>
+        </w:trPr>
+        <w:tc>
+          <w:tcPr>
+            <w:tcW w:type="dxa" w:w="3360"/>
+            <w:tcMar>
+              <w:top w:type="dxa" w:w="60"/>
+              <w:left w:type="dxa" w:w="90"/>
+              <w:bottom w:type="dxa" w:w="60"/>
+              <w:right w:type="dxa" w:w="90"/>
+            </w:tcMar>
+          </w:tcPr>
+          <w:p>
+            <w:pPr>
+              <w:spacing w:after="0" w:line="240"/>
+              <w:jc w:val="left"/>
+            </w:pPr>
+            <w:r>
+              <w:rPr>
+                <w:rFonts w:ascii="Times New Roman" w:cs="Times New Roman" w:eastAsia="Times New Roman" w:hAnsi="Times New Roman"/>
+                <w:b w:val="false"/>
+                <w:bCs w:val="false"/>
+                <w:color w:val="000000"/>
+                <w:sz w:val="20"/>
+                <w:szCs w:val="20"/>
+              </w:rPr>
+              <w:t xml:space="preserve">Thân xe đã chồng lên nhau (TTC = 0)</w:t>
+            </w:r>
+          </w:p>
+        </w:tc>
+        <w:tc>
+          <w:tcPr>
+            <w:tcW w:type="dxa" w:w="1512"/>
+            <w:tcMar>
+              <w:top w:type="dxa" w:w="60"/>
+              <w:left w:type="dxa" w:w="90"/>
+              <w:bottom w:type="dxa" w:w="60"/>
+              <w:right w:type="dxa" w:w="90"/>
+            </w:tcMar>
+          </w:tcPr>
+          <w:p>
+            <w:pPr>
+              <w:spacing w:after="0" w:line="240"/>
+              <w:jc w:val="center"/>
+            </w:pPr>
+            <w:r>
+              <w:rPr>
+                <w:rFonts w:ascii="Times New Roman" w:cs="Times New Roman" w:eastAsia="Times New Roman" w:hAnsi="Times New Roman"/>
+                <w:b w:val="false"/>
+                <w:bCs w:val="false"/>
+                <w:color w:val="000000"/>
+                <w:sz w:val="20"/>
+                <w:szCs w:val="20"/>
+              </w:rPr>
+              <w:t xml:space="preserve">55</w:t>
+            </w:r>
+          </w:p>
+        </w:tc>
+        <w:tc>
+          <w:tcPr>
+            <w:tcW w:type="dxa" w:w="1512"/>
+            <w:tcMar>
+              <w:top w:type="dxa" w:w="60"/>
+              <w:left w:type="dxa" w:w="90"/>
+              <w:bottom w:type="dxa" w:w="60"/>
+              <w:right w:type="dxa" w:w="90"/>
+            </w:tcMar>
+          </w:tcPr>
+          <w:p>
+            <w:pPr>
+              <w:spacing w:after="0" w:line="240"/>
+              <w:jc w:val="center"/>
+            </w:pPr>
+            <w:r>
+              <w:rPr>
+                <w:rFonts w:ascii="Times New Roman" w:cs="Times New Roman" w:eastAsia="Times New Roman" w:hAnsi="Times New Roman"/>
+                <w:b w:val="false"/>
+                <w:bCs w:val="false"/>
+                <w:color w:val="000000"/>
+                <w:sz w:val="20"/>
+                <w:szCs w:val="20"/>
+              </w:rPr>
+              <w:t xml:space="preserve">44</w:t>
+            </w:r>
+          </w:p>
+        </w:tc>
+        <w:tc>
+          <w:tcPr>
+            <w:tcW w:type="dxa" w:w="1344"/>
+            <w:tcMar>
+              <w:top w:type="dxa" w:w="60"/>
+              <w:left w:type="dxa" w:w="90"/>
+              <w:bottom w:type="dxa" w:w="60"/>
+              <w:right w:type="dxa" w:w="90"/>
+            </w:tcMar>
+          </w:tcPr>
+          <w:p>
+            <w:pPr>
+              <w:spacing w:after="0" w:line="240"/>
+              <w:jc w:val="center"/>
+            </w:pPr>
+            <w:r>
+              <w:rPr>
+                <w:rFonts w:ascii="Times New Roman" w:cs="Times New Roman" w:eastAsia="Times New Roman" w:hAnsi="Times New Roman"/>
+                <w:b w:val="false"/>
+                <w:bCs w:val="false"/>
+                <w:color w:val="000000"/>
+                <w:sz w:val="20"/>
+                <w:szCs w:val="20"/>
+              </w:rPr>
+              <w:t xml:space="preserve">0,800</w:t>
+            </w:r>
+          </w:p>
+        </w:tc>
+        <w:tc>
+          <w:tcPr>
+            <w:tcW w:type="dxa" w:w="1344"/>
+            <w:tcMar>
+              <w:top w:type="dxa" w:w="60"/>
+              <w:left w:type="dxa" w:w="90"/>
+              <w:bottom w:type="dxa" w:w="60"/>
+              <w:right w:type="dxa" w:w="90"/>
+            </w:tcMar>
+          </w:tcPr>
+          <w:p>
+            <w:pPr>
+              <w:spacing w:after="0" w:line="240"/>
+              <w:jc w:val="center"/>
+            </w:pPr>
+            <w:r>
+              <w:rPr>
+                <w:rFonts w:ascii="Times New Roman" w:cs="Times New Roman" w:eastAsia="Times New Roman" w:hAnsi="Times New Roman"/>
+                <w:b w:val="false"/>
+                <w:bCs w:val="false"/>
+                <w:color w:val="000000"/>
+                <w:sz w:val="20"/>
+                <w:szCs w:val="20"/>
+              </w:rPr>
+              <w:t xml:space="preserve">0,112 s</w:t>
+            </w:r>
+          </w:p>
+        </w:tc>
+      </w:tr>
+      <w:tr>
+        <w:trPr>
+          <w:cantSplit/>
+        </w:trPr>
+        <w:tc>
+          <w:tcPr>
+            <w:tcW w:type="dxa" w:w="3360"/>
+            <w:tcMar>
+              <w:top w:type="dxa" w:w="60"/>
+              <w:left w:type="dxa" w:w="90"/>
+              <w:bottom w:type="dxa" w:w="60"/>
+              <w:right w:type="dxa" w:w="90"/>
+            </w:tcMar>
+          </w:tcPr>
+          <w:p>
+            <w:pPr>
+              <w:spacing w:after="0" w:line="240"/>
+              <w:jc w:val="left"/>
+            </w:pPr>
+            <w:r>
+              <w:rPr>
+                <w:rFonts w:ascii="Times New Roman" w:cs="Times New Roman" w:eastAsia="Times New Roman" w:hAnsi="Times New Roman"/>
+                <w:b w:val="false"/>
+                <w:bCs w:val="false"/>
+                <w:color w:val="000000"/>
+                <w:sz w:val="20"/>
+                <w:szCs w:val="20"/>
+              </w:rPr>
+              <w:t xml:space="preserve">Chưa chạm, TTC dưới 1,0 s</w:t>
+            </w:r>
+          </w:p>
+        </w:tc>
+        <w:tc>
+          <w:tcPr>
+            <w:tcW w:type="dxa" w:w="1512"/>
+            <w:tcMar>
+              <w:top w:type="dxa" w:w="60"/>
+              <w:left w:type="dxa" w:w="90"/>
+              <w:bottom w:type="dxa" w:w="60"/>
+              <w:right w:type="dxa" w:w="90"/>
+            </w:tcMar>
+          </w:tcPr>
+          <w:p>
+            <w:pPr>
+              <w:spacing w:after="0" w:line="240"/>
+              <w:jc w:val="center"/>
+            </w:pPr>
+            <w:r>
+              <w:rPr>
+                <w:rFonts w:ascii="Times New Roman" w:cs="Times New Roman" w:eastAsia="Times New Roman" w:hAnsi="Times New Roman"/>
+                <w:b w:val="false"/>
+                <w:bCs w:val="false"/>
+                <w:color w:val="000000"/>
+                <w:sz w:val="20"/>
+                <w:szCs w:val="20"/>
+              </w:rPr>
+              <w:t xml:space="preserve">22</w:t>
+            </w:r>
+          </w:p>
+        </w:tc>
+        <w:tc>
+          <w:tcPr>
+            <w:tcW w:type="dxa" w:w="1512"/>
+            <w:tcMar>
+              <w:top w:type="dxa" w:w="60"/>
+              <w:left w:type="dxa" w:w="90"/>
+              <w:bottom w:type="dxa" w:w="60"/>
+              <w:right w:type="dxa" w:w="90"/>
+            </w:tcMar>
+          </w:tcPr>
+          <w:p>
+            <w:pPr>
+              <w:spacing w:after="0" w:line="240"/>
+              <w:jc w:val="center"/>
+            </w:pPr>
+            <w:r>
+              <w:rPr>
+                <w:rFonts w:ascii="Times New Roman" w:cs="Times New Roman" w:eastAsia="Times New Roman" w:hAnsi="Times New Roman"/>
+                <w:b w:val="false"/>
+                <w:bCs w:val="false"/>
+                <w:color w:val="000000"/>
+                <w:sz w:val="20"/>
+                <w:szCs w:val="20"/>
+              </w:rPr>
+              <w:t xml:space="preserve">17</w:t>
+            </w:r>
+          </w:p>
+        </w:tc>
+        <w:tc>
+          <w:tcPr>
+            <w:tcW w:type="dxa" w:w="1344"/>
+            <w:tcMar>
+              <w:top w:type="dxa" w:w="60"/>
+              <w:left w:type="dxa" w:w="90"/>
+              <w:bottom w:type="dxa" w:w="60"/>
+              <w:right w:type="dxa" w:w="90"/>
+            </w:tcMar>
+          </w:tcPr>
+          <w:p>
+            <w:pPr>
+              <w:spacing w:after="0" w:line="240"/>
+              <w:jc w:val="center"/>
+            </w:pPr>
+            <w:r>
+              <w:rPr>
+                <w:rFonts w:ascii="Times New Roman" w:cs="Times New Roman" w:eastAsia="Times New Roman" w:hAnsi="Times New Roman"/>
+                <w:b w:val="false"/>
+                <w:bCs w:val="false"/>
+                <w:color w:val="000000"/>
+                <w:sz w:val="20"/>
+                <w:szCs w:val="20"/>
+              </w:rPr>
+              <w:t xml:space="preserve">0,773</w:t>
+            </w:r>
+          </w:p>
+        </w:tc>
+        <w:tc>
+          <w:tcPr>
+            <w:tcW w:type="dxa" w:w="1344"/>
+            <w:tcMar>
+              <w:top w:type="dxa" w:w="60"/>
+              <w:left w:type="dxa" w:w="90"/>
+              <w:bottom w:type="dxa" w:w="60"/>
+              <w:right w:type="dxa" w:w="90"/>
+            </w:tcMar>
+          </w:tcPr>
+          <w:p>
+            <w:pPr>
+              <w:spacing w:after="0" w:line="240"/>
+              <w:jc w:val="center"/>
+            </w:pPr>
+            <w:r>
+              <w:rPr>
+                <w:rFonts w:ascii="Times New Roman" w:cs="Times New Roman" w:eastAsia="Times New Roman" w:hAnsi="Times New Roman"/>
+                <w:b w:val="false"/>
+                <w:bCs w:val="false"/>
+                <w:color w:val="000000"/>
+                <w:sz w:val="20"/>
+                <w:szCs w:val="20"/>
+              </w:rPr>
+              <w:t xml:space="preserve">0,235 s</w:t>
+            </w:r>
+          </w:p>
+        </w:tc>
+      </w:tr>
+      <w:tr>
+        <w:trPr>
+          <w:cantSplit/>
+        </w:trPr>
+        <w:tc>
+          <w:tcPr>
+            <w:tcW w:type="dxa" w:w="3360"/>
+            <w:tcMar>
+              <w:top w:type="dxa" w:w="60"/>
+              <w:left w:type="dxa" w:w="90"/>
+              <w:bottom w:type="dxa" w:w="60"/>
+              <w:right w:type="dxa" w:w="90"/>
+            </w:tcMar>
+          </w:tcPr>
+          <w:p>
+            <w:pPr>
+              <w:spacing w:after="0" w:line="240"/>
+              <w:jc w:val="left"/>
+            </w:pPr>
+            <w:r>
+              <w:rPr>
+                <w:rFonts w:ascii="Times New Roman" w:cs="Times New Roman" w:eastAsia="Times New Roman" w:hAnsi="Times New Roman"/>
+                <w:b w:val="false"/>
+                <w:bCs w:val="false"/>
+                <w:color w:val="000000"/>
+                <w:sz w:val="20"/>
+                <w:szCs w:val="20"/>
+              </w:rPr>
+              <w:t xml:space="preserve">Chưa chạm, TTC từ 1,0 s trở lên</w:t>
+            </w:r>
+          </w:p>
+        </w:tc>
+        <w:tc>
+          <w:tcPr>
+            <w:tcW w:type="dxa" w:w="1512"/>
+            <w:tcMar>
+              <w:top w:type="dxa" w:w="60"/>
+              <w:left w:type="dxa" w:w="90"/>
+              <w:bottom w:type="dxa" w:w="60"/>
+              <w:right w:type="dxa" w:w="90"/>
+            </w:tcMar>
+          </w:tcPr>
+          <w:p>
+            <w:pPr>
+              <w:spacing w:after="0" w:line="240"/>
+              <w:jc w:val="center"/>
+            </w:pPr>
+            <w:r>
+              <w:rPr>
+                <w:rFonts w:ascii="Times New Roman" w:cs="Times New Roman" w:eastAsia="Times New Roman" w:hAnsi="Times New Roman"/>
+                <w:b w:val="false"/>
+                <w:bCs w:val="false"/>
+                <w:color w:val="000000"/>
+                <w:sz w:val="20"/>
+                <w:szCs w:val="20"/>
+              </w:rPr>
+              <w:t xml:space="preserve">46</w:t>
+            </w:r>
+          </w:p>
+        </w:tc>
+        <w:tc>
+          <w:tcPr>
+            <w:tcW w:type="dxa" w:w="1512"/>
+            <w:tcMar>
+              <w:top w:type="dxa" w:w="60"/>
+              <w:left w:type="dxa" w:w="90"/>
+              <w:bottom w:type="dxa" w:w="60"/>
+              <w:right w:type="dxa" w:w="90"/>
+            </w:tcMar>
+          </w:tcPr>
+          <w:p>
+            <w:pPr>
+              <w:spacing w:after="0" w:line="240"/>
+              <w:jc w:val="center"/>
+            </w:pPr>
+            <w:r>
+              <w:rPr>
+                <w:rFonts w:ascii="Times New Roman" w:cs="Times New Roman" w:eastAsia="Times New Roman" w:hAnsi="Times New Roman"/>
+                <w:b w:val="false"/>
+                <w:bCs w:val="false"/>
+                <w:color w:val="000000"/>
+                <w:sz w:val="20"/>
+                <w:szCs w:val="20"/>
+              </w:rPr>
+              <w:t xml:space="preserve">16</w:t>
+            </w:r>
+          </w:p>
+        </w:tc>
+        <w:tc>
+          <w:tcPr>
+            <w:tcW w:type="dxa" w:w="1344"/>
+            <w:tcMar>
+              <w:top w:type="dxa" w:w="60"/>
+              <w:left w:type="dxa" w:w="90"/>
+              <w:bottom w:type="dxa" w:w="60"/>
+              <w:right w:type="dxa" w:w="90"/>
+            </w:tcMar>
+          </w:tcPr>
+          <w:p>
+            <w:pPr>
+              <w:spacing w:after="0" w:line="240"/>
+              <w:jc w:val="center"/>
+            </w:pPr>
+            <w:r>
+              <w:rPr>
+                <w:rFonts w:ascii="Times New Roman" w:cs="Times New Roman" w:eastAsia="Times New Roman" w:hAnsi="Times New Roman"/>
+                <w:b w:val="false"/>
+                <w:bCs w:val="false"/>
+                <w:color w:val="000000"/>
+                <w:sz w:val="20"/>
+                <w:szCs w:val="20"/>
+              </w:rPr>
+              <w:t xml:space="preserve">0,348</w:t>
+            </w:r>
+          </w:p>
+        </w:tc>
+        <w:tc>
+          <w:tcPr>
+            <w:tcW w:type="dxa" w:w="1344"/>
+            <w:tcMar>
+              <w:top w:type="dxa" w:w="60"/>
+              <w:left w:type="dxa" w:w="90"/>
+              <w:bottom w:type="dxa" w:w="60"/>
+              <w:right w:type="dxa" w:w="90"/>
+            </w:tcMar>
+          </w:tcPr>
+          <w:p>
+            <w:pPr>
+              <w:spacing w:after="0" w:line="240"/>
+              <w:jc w:val="center"/>
+            </w:pPr>
+            <w:r>
+              <w:rPr>
+                <w:rFonts w:ascii="Times New Roman" w:cs="Times New Roman" w:eastAsia="Times New Roman" w:hAnsi="Times New Roman"/>
+                <w:b w:val="false"/>
+                <w:bCs w:val="false"/>
+                <w:color w:val="000000"/>
+                <w:sz w:val="20"/>
+                <w:szCs w:val="20"/>
+              </w:rPr>
+              <w:t xml:space="preserve">0,820 s</w:t>
+            </w:r>
+          </w:p>
+        </w:tc>
+      </w:tr>
+    </w:tbl>
+    <w:p>
+      <w:pPr>
+        <w:spacing w:after="120" w:line="276"/>
+        <w:jc w:val="both"/>
+      </w:pPr>
+      <w:r>
+        <w:rPr>
+          <w:rFonts w:ascii="Times New Roman" w:cs="Times New Roman" w:eastAsia="Times New Roman" w:hAnsi="Times New Roman"/>
+          <w:sz w:val="24"/>
+          <w:szCs w:val="24"/>
+        </w:rPr>
+        <w:t xml:space="preserve">Trình mô phỏng chưa có ràng buộc chống va chạm, nên 55 nhãn chuẩn là lúc hai thân xe đã chồng lên nhau (TTC = 0), tức va chạm trong mô phỏng. Tách riêng 22 nhãn chưa chạm của dải dưới 1 giây, Recall là 0,773, gần với con số của cả dải.</w:t>
+      </w:r>
+    </w:p>
     <w:p>
       <w:pPr>
         <w:spacing w:after="120" w:line="276"/>
@@ -5721,7 +6341,7 @@
           <w:sz w:val="26"/>
           <w:szCs w:val="26"/>
         </w:rPr>
-        <w:t xml:space="preserve">7.3. Bảng ablation — đóng góp của từng khối</w:t>
+        <w:t xml:space="preserve">7.3. Bảng ablation - đóng góp của từng khối</w:t>
       </w:r>
     </w:p>
     <w:p>
@@ -6167,7 +6787,7 @@
                 <w:sz w:val="20"/>
                 <w:szCs w:val="20"/>
               </w:rPr>
-              <w:t xml:space="preserve">0,075</w:t>
+              <w:t xml:space="preserve">0,073</w:t>
             </w:r>
           </w:p>
         </w:tc>
@@ -6195,7 +6815,7 @@
                 <w:sz w:val="20"/>
                 <w:szCs w:val="20"/>
               </w:rPr>
-              <w:t xml:space="preserve">0,684</w:t>
+              <w:t xml:space="preserve">0,671</w:t>
             </w:r>
           </w:p>
         </w:tc>
@@ -6223,7 +6843,7 @@
                 <w:sz w:val="20"/>
                 <w:szCs w:val="20"/>
               </w:rPr>
-              <w:t xml:space="preserve">0,135</w:t>
+              <w:t xml:space="preserve">0,132</w:t>
             </w:r>
           </w:p>
         </w:tc>
@@ -6251,7 +6871,7 @@
                 <w:sz w:val="20"/>
                 <w:szCs w:val="20"/>
               </w:rPr>
-              <w:t xml:space="preserve">0,395</w:t>
+              <w:t xml:space="preserve">0,401</w:t>
             </w:r>
           </w:p>
         </w:tc>
@@ -6279,7 +6899,7 @@
                 <w:sz w:val="20"/>
                 <w:szCs w:val="20"/>
               </w:rPr>
-              <w:t xml:space="preserve">1711</w:t>
+              <w:t xml:space="preserve">1713</w:t>
             </w:r>
           </w:p>
         </w:tc>
@@ -7007,7 +7627,7 @@
           <w:sz w:val="24"/>
           <w:szCs w:val="24"/>
         </w:rPr>
-        <w:t xml:space="preserve">Homography làm Recall nhảy từ 0,020 lên 0,684 — vì trước đó TTC được tính trên đơn vị pixel, vốn không phải đại lượng vật lý, nên hầu như không sự kiện nào khớp với nhãn chuẩn.</w:t>
+        <w:t xml:space="preserve">Homography làm Recall nhảy từ 0,020 lên 0,671 - vì trước đó TTC được tính trên đơn vị pixel, vốn không phải đại lượng vật lý, nên hầu như không sự kiện nào khớp với nhãn chuẩn.</w:t>
       </w:r>
     </w:p>
     <w:p>
@@ -7045,7 +7665,7 @@
           <w:sz w:val="24"/>
           <w:szCs w:val="24"/>
         </w:rPr>
-        <w:t xml:space="preserve">PET nâng Recall thêm 3,3 điểm phần trăm — bắt được nhóm tình huống "vừa lướt qua" mà TTC bỏ sót. Mức tăng nhỏ nhưng đúng nhóm: đây là những tình huống mà chỉ số TTC về nguyên tắc không thể phát hiện.</w:t>
+        <w:t xml:space="preserve">PET nâng Recall thêm 3,3 điểm phần trăm - bắt được nhóm tình huống "vừa lướt qua" mà TTC bỏ sót. Mức tăng nhỏ nhưng đúng nhóm: đây là những tình huống mà chỉ số TTC về nguyên tắc không thể phát hiện.</w:t>
       </w:r>
     </w:p>
     <w:p>
@@ -7064,7 +7684,7 @@
           <w:sz w:val="24"/>
           <w:szCs w:val="24"/>
         </w:rPr>
-        <w:t xml:space="preserve">Cổng khoảng cách là bước có tác dụng lớn nhất lên F1: Precision tăng gấp 4,6 lần (0,103 → 0,471), đổi lại Recall giảm 17,1 điểm phần trăm (0,711 → 0,539). Đây là một đánh đổi có chủ ý, không phải cải thiện miễn phí: 1249 sự kiện bị lọc xuống còn 211, trong đó có cả một phần near-miss thật. Chúng tôi chọn cấu hình này vì F1 tăng từ 0,180 lên 0,503 và vì Recall ở dải nguy cấp — dải quyết định giá trị sử dụng — vẫn giữ được 0,792 (mục 7.2).</w:t>
+        <w:t xml:space="preserve">Cổng khoảng cách là bước có tác dụng lớn nhất lên F1: Precision tăng gấp 4,6 lần (0,103 → 0,471), đổi lại Recall giảm 17,1 điểm phần trăm (0,711 → 0,539). Đây là một đánh đổi có chủ ý, không phải cải thiện miễn phí: 1249 sự kiện bị lọc xuống còn 211, trong đó có cả một phần near-miss thật. Chúng tôi chọn cấu hình này vì F1 tăng từ 0,180 lên 0,503 và vì Recall ở dải nguy cấp - dải quyết định giá trị sử dụng - vẫn giữ được 0,792 (mục 7.2).</w:t>
       </w:r>
     </w:p>
     <w:p>
@@ -8175,7 +8795,7 @@
           <w:sz w:val="24"/>
           <w:szCs w:val="24"/>
         </w:rPr>
-        <w:t xml:space="preserve">Tracking gần như không suy giảm cho tới mức nhiễu 6 px (IDF1 vẫn 0,98) nhờ cơ chế nới biên bbox khi ghép. Precision là thành phần nhạy cảm nhất — giảm từ 0,557 xuống 0,233 khi nhiễu tăng từ 0 lên 6 px, cho thấy chất lượng detector là nút thắt chính của toàn hệ thống.</w:t>
+        <w:t xml:space="preserve">Tracking gần như không suy giảm cho tới mức nhiễu 6 px (IDF1 vẫn 0,98) nhờ cơ chế nới biên bbox khi ghép. Precision là thành phần nhạy cảm nhất - giảm từ 0,557 xuống 0,233 khi nhiễu tăng từ 0 lên 6 px, cho thấy chất lượng detector là nút thắt chính của toàn hệ thống.</w:t>
       </w:r>
     </w:p>
     <w:p>
@@ -8206,22 +8826,577 @@
           <w:sz w:val="24"/>
           <w:szCs w:val="24"/>
         </w:rPr>
-        <w:t xml:space="preserve">Chạy lệnh sau để sinh phần này, sau khi đã chuẩn bị dataset thật:</w:t>
+        <w:t xml:space="preserve">Trên 2.441 ảnh MVTI, cùng trọng số COCO gốc, cùng cách chấm COCO (ngưỡng 0,001, tối đa 100 hộp mỗi ảnh) và cùng ngưỡng vận hành 0,15:</w:t>
       </w:r>
     </w:p>
+    <w:tbl>
+      <w:tblPr>
+        <w:tblW w:type="dxa" w:w="9072"/>
+        <w:tblBorders>
+          <w:top w:val="single" w:color="auto" w:sz="4"/>
+          <w:left w:val="single" w:color="auto" w:sz="4"/>
+          <w:bottom w:val="single" w:color="auto" w:sz="4"/>
+          <w:right w:val="single" w:color="auto" w:sz="4"/>
+          <w:insideH w:val="single" w:color="auto" w:sz="4"/>
+          <w:insideV w:val="single" w:color="auto" w:sz="4"/>
+        </w:tblBorders>
+      </w:tblPr>
+      <w:tblGrid>
+        <w:gridCol w:w="3175"/>
+        <w:gridCol w:w="2948"/>
+        <w:gridCol w:w="2949"/>
+      </w:tblGrid>
+      <w:tr>
+        <w:trPr>
+          <w:cantSplit/>
+          <w:tblHeader/>
+        </w:trPr>
+        <w:tc>
+          <w:tcPr>
+            <w:tcW w:type="dxa" w:w="3175"/>
+            <w:shd w:fill="1F4E79" w:val="clear"/>
+            <w:tcMar>
+              <w:top w:type="dxa" w:w="60"/>
+              <w:left w:type="dxa" w:w="90"/>
+              <w:bottom w:type="dxa" w:w="60"/>
+              <w:right w:type="dxa" w:w="90"/>
+            </w:tcMar>
+          </w:tcPr>
+          <w:p>
+            <w:pPr>
+              <w:spacing w:after="0" w:line="240"/>
+              <w:jc w:val="left"/>
+            </w:pPr>
+            <w:r>
+              <w:rPr>
+                <w:rFonts w:ascii="Times New Roman" w:cs="Times New Roman" w:eastAsia="Times New Roman" w:hAnsi="Times New Roman"/>
+                <w:b/>
+                <w:bCs/>
+                <w:color w:val="FFFFFF"/>
+                <w:sz w:val="20"/>
+                <w:szCs w:val="20"/>
+              </w:rPr>
+              <w:t xml:space="preserve">Chỉ số</w:t>
+            </w:r>
+          </w:p>
+        </w:tc>
+        <w:tc>
+          <w:tcPr>
+            <w:tcW w:type="dxa" w:w="2948"/>
+            <w:shd w:fill="1F4E79" w:val="clear"/>
+            <w:tcMar>
+              <w:top w:type="dxa" w:w="60"/>
+              <w:left w:type="dxa" w:w="90"/>
+              <w:bottom w:type="dxa" w:w="60"/>
+              <w:right w:type="dxa" w:w="90"/>
+            </w:tcMar>
+          </w:tcPr>
+          <w:p>
+            <w:pPr>
+              <w:spacing w:after="0" w:line="240"/>
+              <w:jc w:val="center"/>
+            </w:pPr>
+            <w:r>
+              <w:rPr>
+                <w:rFonts w:ascii="Times New Roman" w:cs="Times New Roman" w:eastAsia="Times New Roman" w:hAnsi="Times New Roman"/>
+                <w:b/>
+                <w:bCs/>
+                <w:color w:val="FFFFFF"/>
+                <w:sz w:val="20"/>
+                <w:szCs w:val="20"/>
+              </w:rPr>
+              <w:t xml:space="preserve">Một lượt toàn khung (mặc định)</w:t>
+            </w:r>
+          </w:p>
+        </w:tc>
+        <w:tc>
+          <w:tcPr>
+            <w:tcW w:type="dxa" w:w="2949"/>
+            <w:shd w:fill="1F4E79" w:val="clear"/>
+            <w:tcMar>
+              <w:top w:type="dxa" w:w="60"/>
+              <w:left w:type="dxa" w:w="90"/>
+              <w:bottom w:type="dxa" w:w="60"/>
+              <w:right w:type="dxa" w:w="90"/>
+            </w:tcMar>
+          </w:tcPr>
+          <w:p>
+            <w:pPr>
+              <w:spacing w:after="0" w:line="240"/>
+              <w:jc w:val="center"/>
+            </w:pPr>
+            <w:r>
+              <w:rPr>
+                <w:rFonts w:ascii="Times New Roman" w:cs="Times New Roman" w:eastAsia="Times New Roman" w:hAnsi="Times New Roman"/>
+                <w:b/>
+                <w:bCs/>
+                <w:color w:val="FFFFFF"/>
+                <w:sz w:val="20"/>
+                <w:szCs w:val="20"/>
+              </w:rPr>
+              <w:t xml:space="preserve">Chia ô 2×3 và lượt toàn khung</w:t>
+            </w:r>
+          </w:p>
+        </w:tc>
+      </w:tr>
+      <w:tr>
+        <w:trPr>
+          <w:cantSplit/>
+        </w:trPr>
+        <w:tc>
+          <w:tcPr>
+            <w:tcW w:type="dxa" w:w="3175"/>
+            <w:tcMar>
+              <w:top w:type="dxa" w:w="60"/>
+              <w:left w:type="dxa" w:w="90"/>
+              <w:bottom w:type="dxa" w:w="60"/>
+              <w:right w:type="dxa" w:w="90"/>
+            </w:tcMar>
+          </w:tcPr>
+          <w:p>
+            <w:pPr>
+              <w:spacing w:after="0" w:line="240"/>
+              <w:jc w:val="left"/>
+            </w:pPr>
+            <w:r>
+              <w:rPr>
+                <w:rFonts w:ascii="Times New Roman" w:cs="Times New Roman" w:eastAsia="Times New Roman" w:hAnsi="Times New Roman"/>
+                <w:b w:val="false"/>
+                <w:bCs w:val="false"/>
+                <w:color w:val="000000"/>
+                <w:sz w:val="20"/>
+                <w:szCs w:val="20"/>
+              </w:rPr>
+              <w:t xml:space="preserve">mAP@0,5</w:t>
+            </w:r>
+          </w:p>
+        </w:tc>
+        <w:tc>
+          <w:tcPr>
+            <w:tcW w:type="dxa" w:w="2948"/>
+            <w:tcMar>
+              <w:top w:type="dxa" w:w="60"/>
+              <w:left w:type="dxa" w:w="90"/>
+              <w:bottom w:type="dxa" w:w="60"/>
+              <w:right w:type="dxa" w:w="90"/>
+            </w:tcMar>
+          </w:tcPr>
+          <w:p>
+            <w:pPr>
+              <w:spacing w:after="0" w:line="240"/>
+              <w:jc w:val="center"/>
+            </w:pPr>
+            <w:r>
+              <w:rPr>
+                <w:rFonts w:ascii="Times New Roman" w:cs="Times New Roman" w:eastAsia="Times New Roman" w:hAnsi="Times New Roman"/>
+                <w:b w:val="false"/>
+                <w:bCs w:val="false"/>
+                <w:color w:val="000000"/>
+                <w:sz w:val="20"/>
+                <w:szCs w:val="20"/>
+              </w:rPr>
+              <w:t xml:space="preserve">0,208</w:t>
+            </w:r>
+          </w:p>
+        </w:tc>
+        <w:tc>
+          <w:tcPr>
+            <w:tcW w:type="dxa" w:w="2949"/>
+            <w:tcMar>
+              <w:top w:type="dxa" w:w="60"/>
+              <w:left w:type="dxa" w:w="90"/>
+              <w:bottom w:type="dxa" w:w="60"/>
+              <w:right w:type="dxa" w:w="90"/>
+            </w:tcMar>
+          </w:tcPr>
+          <w:p>
+            <w:pPr>
+              <w:spacing w:after="0" w:line="240"/>
+              <w:jc w:val="center"/>
+            </w:pPr>
+            <w:r>
+              <w:rPr>
+                <w:rFonts w:ascii="Times New Roman" w:cs="Times New Roman" w:eastAsia="Times New Roman" w:hAnsi="Times New Roman"/>
+                <w:b w:val="false"/>
+                <w:bCs w:val="false"/>
+                <w:color w:val="000000"/>
+                <w:sz w:val="20"/>
+                <w:szCs w:val="20"/>
+              </w:rPr>
+              <w:t xml:space="preserve">0,164</w:t>
+            </w:r>
+          </w:p>
+        </w:tc>
+      </w:tr>
+      <w:tr>
+        <w:trPr>
+          <w:cantSplit/>
+        </w:trPr>
+        <w:tc>
+          <w:tcPr>
+            <w:tcW w:type="dxa" w:w="3175"/>
+            <w:tcMar>
+              <w:top w:type="dxa" w:w="60"/>
+              <w:left w:type="dxa" w:w="90"/>
+              <w:bottom w:type="dxa" w:w="60"/>
+              <w:right w:type="dxa" w:w="90"/>
+            </w:tcMar>
+          </w:tcPr>
+          <w:p>
+            <w:pPr>
+              <w:spacing w:after="0" w:line="240"/>
+              <w:jc w:val="left"/>
+            </w:pPr>
+            <w:r>
+              <w:rPr>
+                <w:rFonts w:ascii="Times New Roman" w:cs="Times New Roman" w:eastAsia="Times New Roman" w:hAnsi="Times New Roman"/>
+                <w:b w:val="false"/>
+                <w:bCs w:val="false"/>
+                <w:color w:val="000000"/>
+                <w:sz w:val="20"/>
+                <w:szCs w:val="20"/>
+              </w:rPr>
+              <w:t xml:space="preserve">mAP@0,5:0,95</w:t>
+            </w:r>
+          </w:p>
+        </w:tc>
+        <w:tc>
+          <w:tcPr>
+            <w:tcW w:type="dxa" w:w="2948"/>
+            <w:tcMar>
+              <w:top w:type="dxa" w:w="60"/>
+              <w:left w:type="dxa" w:w="90"/>
+              <w:bottom w:type="dxa" w:w="60"/>
+              <w:right w:type="dxa" w:w="90"/>
+            </w:tcMar>
+          </w:tcPr>
+          <w:p>
+            <w:pPr>
+              <w:spacing w:after="0" w:line="240"/>
+              <w:jc w:val="center"/>
+            </w:pPr>
+            <w:r>
+              <w:rPr>
+                <w:rFonts w:ascii="Times New Roman" w:cs="Times New Roman" w:eastAsia="Times New Roman" w:hAnsi="Times New Roman"/>
+                <w:b w:val="false"/>
+                <w:bCs w:val="false"/>
+                <w:color w:val="000000"/>
+                <w:sz w:val="20"/>
+                <w:szCs w:val="20"/>
+              </w:rPr>
+              <w:t xml:space="preserve">0,139</w:t>
+            </w:r>
+          </w:p>
+        </w:tc>
+        <w:tc>
+          <w:tcPr>
+            <w:tcW w:type="dxa" w:w="2949"/>
+            <w:tcMar>
+              <w:top w:type="dxa" w:w="60"/>
+              <w:left w:type="dxa" w:w="90"/>
+              <w:bottom w:type="dxa" w:w="60"/>
+              <w:right w:type="dxa" w:w="90"/>
+            </w:tcMar>
+          </w:tcPr>
+          <w:p>
+            <w:pPr>
+              <w:spacing w:after="0" w:line="240"/>
+              <w:jc w:val="center"/>
+            </w:pPr>
+            <w:r>
+              <w:rPr>
+                <w:rFonts w:ascii="Times New Roman" w:cs="Times New Roman" w:eastAsia="Times New Roman" w:hAnsi="Times New Roman"/>
+                <w:b w:val="false"/>
+                <w:bCs w:val="false"/>
+                <w:color w:val="000000"/>
+                <w:sz w:val="20"/>
+                <w:szCs w:val="20"/>
+              </w:rPr>
+              <w:t xml:space="preserve">0,104</w:t>
+            </w:r>
+          </w:p>
+        </w:tc>
+      </w:tr>
+      <w:tr>
+        <w:trPr>
+          <w:cantSplit/>
+        </w:trPr>
+        <w:tc>
+          <w:tcPr>
+            <w:tcW w:type="dxa" w:w="3175"/>
+            <w:tcMar>
+              <w:top w:type="dxa" w:w="60"/>
+              <w:left w:type="dxa" w:w="90"/>
+              <w:bottom w:type="dxa" w:w="60"/>
+              <w:right w:type="dxa" w:w="90"/>
+            </w:tcMar>
+          </w:tcPr>
+          <w:p>
+            <w:pPr>
+              <w:spacing w:after="0" w:line="240"/>
+              <w:jc w:val="left"/>
+            </w:pPr>
+            <w:r>
+              <w:rPr>
+                <w:rFonts w:ascii="Times New Roman" w:cs="Times New Roman" w:eastAsia="Times New Roman" w:hAnsi="Times New Roman"/>
+                <w:b w:val="false"/>
+                <w:bCs w:val="false"/>
+                <w:color w:val="000000"/>
+                <w:sz w:val="20"/>
+                <w:szCs w:val="20"/>
+              </w:rPr>
+              <w:t xml:space="preserve">Precision / Recall ở ngưỡng 0,15</w:t>
+            </w:r>
+          </w:p>
+        </w:tc>
+        <w:tc>
+          <w:tcPr>
+            <w:tcW w:type="dxa" w:w="2948"/>
+            <w:tcMar>
+              <w:top w:type="dxa" w:w="60"/>
+              <w:left w:type="dxa" w:w="90"/>
+              <w:bottom w:type="dxa" w:w="60"/>
+              <w:right w:type="dxa" w:w="90"/>
+            </w:tcMar>
+          </w:tcPr>
+          <w:p>
+            <w:pPr>
+              <w:spacing w:after="0" w:line="240"/>
+              <w:jc w:val="center"/>
+            </w:pPr>
+            <w:r>
+              <w:rPr>
+                <w:rFonts w:ascii="Times New Roman" w:cs="Times New Roman" w:eastAsia="Times New Roman" w:hAnsi="Times New Roman"/>
+                <w:b w:val="false"/>
+                <w:bCs w:val="false"/>
+                <w:color w:val="000000"/>
+                <w:sz w:val="20"/>
+                <w:szCs w:val="20"/>
+              </w:rPr>
+              <w:t xml:space="preserve">0,468 / 0,277</w:t>
+            </w:r>
+          </w:p>
+        </w:tc>
+        <w:tc>
+          <w:tcPr>
+            <w:tcW w:type="dxa" w:w="2949"/>
+            <w:tcMar>
+              <w:top w:type="dxa" w:w="60"/>
+              <w:left w:type="dxa" w:w="90"/>
+              <w:bottom w:type="dxa" w:w="60"/>
+              <w:right w:type="dxa" w:w="90"/>
+            </w:tcMar>
+          </w:tcPr>
+          <w:p>
+            <w:pPr>
+              <w:spacing w:after="0" w:line="240"/>
+              <w:jc w:val="center"/>
+            </w:pPr>
+            <w:r>
+              <w:rPr>
+                <w:rFonts w:ascii="Times New Roman" w:cs="Times New Roman" w:eastAsia="Times New Roman" w:hAnsi="Times New Roman"/>
+                <w:b w:val="false"/>
+                <w:bCs w:val="false"/>
+                <w:color w:val="000000"/>
+                <w:sz w:val="20"/>
+                <w:szCs w:val="20"/>
+              </w:rPr>
+              <w:t xml:space="preserve">0,353 / 0,323</w:t>
+            </w:r>
+          </w:p>
+        </w:tc>
+      </w:tr>
+      <w:tr>
+        <w:trPr>
+          <w:cantSplit/>
+        </w:trPr>
+        <w:tc>
+          <w:tcPr>
+            <w:tcW w:type="dxa" w:w="3175"/>
+            <w:tcMar>
+              <w:top w:type="dxa" w:w="60"/>
+              <w:left w:type="dxa" w:w="90"/>
+              <w:bottom w:type="dxa" w:w="60"/>
+              <w:right w:type="dxa" w:w="90"/>
+            </w:tcMar>
+          </w:tcPr>
+          <w:p>
+            <w:pPr>
+              <w:spacing w:after="0" w:line="240"/>
+              <w:jc w:val="left"/>
+            </w:pPr>
+            <w:r>
+              <w:rPr>
+                <w:rFonts w:ascii="Times New Roman" w:cs="Times New Roman" w:eastAsia="Times New Roman" w:hAnsi="Times New Roman"/>
+                <w:b w:val="false"/>
+                <w:bCs w:val="false"/>
+                <w:color w:val="000000"/>
+                <w:sz w:val="20"/>
+                <w:szCs w:val="20"/>
+              </w:rPr>
+              <w:t xml:space="preserve">Tracking IDF1 / MOTA</w:t>
+            </w:r>
+          </w:p>
+        </w:tc>
+        <w:tc>
+          <w:tcPr>
+            <w:tcW w:type="dxa" w:w="2948"/>
+            <w:tcMar>
+              <w:top w:type="dxa" w:w="60"/>
+              <w:left w:type="dxa" w:w="90"/>
+              <w:bottom w:type="dxa" w:w="60"/>
+              <w:right w:type="dxa" w:w="90"/>
+            </w:tcMar>
+          </w:tcPr>
+          <w:p>
+            <w:pPr>
+              <w:spacing w:after="0" w:line="240"/>
+              <w:jc w:val="center"/>
+            </w:pPr>
+            <w:r>
+              <w:rPr>
+                <w:rFonts w:ascii="Times New Roman" w:cs="Times New Roman" w:eastAsia="Times New Roman" w:hAnsi="Times New Roman"/>
+                <w:b w:val="false"/>
+                <w:bCs w:val="false"/>
+                <w:color w:val="000000"/>
+                <w:sz w:val="20"/>
+                <w:szCs w:val="20"/>
+              </w:rPr>
+              <w:t xml:space="preserve">0,235 / 0,061</w:t>
+            </w:r>
+          </w:p>
+        </w:tc>
+        <w:tc>
+          <w:tcPr>
+            <w:tcW w:type="dxa" w:w="2949"/>
+            <w:tcMar>
+              <w:top w:type="dxa" w:w="60"/>
+              <w:left w:type="dxa" w:w="90"/>
+              <w:bottom w:type="dxa" w:w="60"/>
+              <w:right w:type="dxa" w:w="90"/>
+            </w:tcMar>
+          </w:tcPr>
+          <w:p>
+            <w:pPr>
+              <w:spacing w:after="0" w:line="240"/>
+              <w:jc w:val="center"/>
+            </w:pPr>
+            <w:r>
+              <w:rPr>
+                <w:rFonts w:ascii="Times New Roman" w:cs="Times New Roman" w:eastAsia="Times New Roman" w:hAnsi="Times New Roman"/>
+                <w:b w:val="false"/>
+                <w:bCs w:val="false"/>
+                <w:color w:val="000000"/>
+                <w:sz w:val="20"/>
+                <w:szCs w:val="20"/>
+              </w:rPr>
+              <w:t xml:space="preserve">0,262 / -0,022</w:t>
+            </w:r>
+          </w:p>
+        </w:tc>
+      </w:tr>
+      <w:tr>
+        <w:trPr>
+          <w:cantSplit/>
+        </w:trPr>
+        <w:tc>
+          <w:tcPr>
+            <w:tcW w:type="dxa" w:w="3175"/>
+            <w:tcMar>
+              <w:top w:type="dxa" w:w="60"/>
+              <w:left w:type="dxa" w:w="90"/>
+              <w:bottom w:type="dxa" w:w="60"/>
+              <w:right w:type="dxa" w:w="90"/>
+            </w:tcMar>
+          </w:tcPr>
+          <w:p>
+            <w:pPr>
+              <w:spacing w:after="0" w:line="240"/>
+              <w:jc w:val="left"/>
+            </w:pPr>
+            <w:r>
+              <w:rPr>
+                <w:rFonts w:ascii="Times New Roman" w:cs="Times New Roman" w:eastAsia="Times New Roman" w:hAnsi="Times New Roman"/>
+                <w:b w:val="false"/>
+                <w:bCs w:val="false"/>
+                <w:color w:val="000000"/>
+                <w:sz w:val="20"/>
+                <w:szCs w:val="20"/>
+              </w:rPr>
+              <w:t xml:space="preserve">Tốc độ (CPU 2 lõi)</w:t>
+            </w:r>
+          </w:p>
+        </w:tc>
+        <w:tc>
+          <w:tcPr>
+            <w:tcW w:type="dxa" w:w="2948"/>
+            <w:tcMar>
+              <w:top w:type="dxa" w:w="60"/>
+              <w:left w:type="dxa" w:w="90"/>
+              <w:bottom w:type="dxa" w:w="60"/>
+              <w:right w:type="dxa" w:w="90"/>
+            </w:tcMar>
+          </w:tcPr>
+          <w:p>
+            <w:pPr>
+              <w:spacing w:after="0" w:line="240"/>
+              <w:jc w:val="center"/>
+            </w:pPr>
+            <w:r>
+              <w:rPr>
+                <w:rFonts w:ascii="Times New Roman" w:cs="Times New Roman" w:eastAsia="Times New Roman" w:hAnsi="Times New Roman"/>
+                <w:b w:val="false"/>
+                <w:bCs w:val="false"/>
+                <w:color w:val="000000"/>
+                <w:sz w:val="20"/>
+                <w:szCs w:val="20"/>
+              </w:rPr>
+              <w:t xml:space="preserve">12,1 FPS</w:t>
+            </w:r>
+          </w:p>
+        </w:tc>
+        <w:tc>
+          <w:tcPr>
+            <w:tcW w:type="dxa" w:w="2949"/>
+            <w:tcMar>
+              <w:top w:type="dxa" w:w="60"/>
+              <w:left w:type="dxa" w:w="90"/>
+              <w:bottom w:type="dxa" w:w="60"/>
+              <w:right w:type="dxa" w:w="90"/>
+            </w:tcMar>
+          </w:tcPr>
+          <w:p>
+            <w:pPr>
+              <w:spacing w:after="0" w:line="240"/>
+              <w:jc w:val="center"/>
+            </w:pPr>
+            <w:r>
+              <w:rPr>
+                <w:rFonts w:ascii="Times New Roman" w:cs="Times New Roman" w:eastAsia="Times New Roman" w:hAnsi="Times New Roman"/>
+                <w:b w:val="false"/>
+                <w:bCs w:val="false"/>
+                <w:color w:val="000000"/>
+                <w:sz w:val="20"/>
+                <w:szCs w:val="20"/>
+              </w:rPr>
+              <w:t xml:space="preserve">1,4 FPS</w:t>
+            </w:r>
+          </w:p>
+        </w:tc>
+      </w:tr>
+    </w:tbl>
     <w:p>
       <w:pPr>
-        <w:spacing w:after="160"/>
-        <w:ind w:left="300"/>
+        <w:spacing w:after="120" w:line="276"/>
+        <w:jc w:val="both"/>
       </w:pPr>
       <w:r>
         <w:rPr>
-          <w:rFonts w:ascii="Consolas" w:cs="Consolas" w:eastAsia="Consolas" w:hAnsi="Consolas"/>
-          <w:sz w:val="20"/>
-          <w:szCs w:val="20"/>
+          <w:rFonts w:ascii="Times New Roman" w:cs="Times New Roman" w:eastAsia="Times New Roman" w:hAnsi="Times New Roman"/>
+          <w:sz w:val="24"/>
+          <w:szCs w:val="24"/>
         </w:rPr>
-        <w:t xml:space="preserve">python -m saferoad prepare-real --root data/raw/mvti
-python -m saferoad evaluate-real</w:t>
+        <w:t xml:space="preserve">Chia ô tăng Recall ở ngưỡng vận hành nhưng giảm Precision và mAP, lại chậm hơn khoảng 9 lần, nên cấu hình mặc định chạy một lượt. Số near-miss trên tập này chỉ là thống kê mô tả vì dữ liệu thật không có nhãn xung đột và chưa có hiệu chuẩn homography thực địa.</w:t>
       </w:r>
     </w:p>
     <w:p>
@@ -8237,7 +9412,7 @@
           <w:sz w:val="24"/>
           <w:szCs w:val="24"/>
         </w:rPr>
-        <w:t xml:space="preserve">Một phát hiện quan trọng. </w:t>
+        <w:t xml:space="preserve">Lệch miền. </w:t>
       </w:r>
       <w:r>
         <w:rPr>
@@ -8245,21 +9420,7 @@
           <w:sz w:val="24"/>
           <w:szCs w:val="24"/>
         </w:rPr>
-        <w:t xml:space="preserve">Đo trực tiếp trên ảnh giao lộ thật, YOLO11n với trọng số COCO gốc chỉ đạt recall@0.5 ≈ 0,19. Trong một khung hình thử, model chỉ phát hiện đúng một vật thể và gán nhầm nhãn "train" cho một chiếc ô tô. Nguyên nhân không phải model yếu mà là lệch miền: COCO chủ yếu gồm ảnh chụp ngang tầm mắt, trong khi camera giao thông đặt cao nhìn chếch xuống, đối tượng nhỏ và bị nén phối cảnh.</w:t>
-      </w:r>
-    </w:p>
-    <w:p>
-      <w:pPr>
-        <w:spacing w:after="120" w:line="276"/>
-        <w:jc w:val="both"/>
-      </w:pPr>
-      <w:r>
-        <w:rPr>
-          <w:rFonts w:ascii="Times New Roman" w:cs="Times New Roman" w:eastAsia="Times New Roman" w:hAnsi="Times New Roman"/>
-          <w:sz w:val="24"/>
-          <w:szCs w:val="24"/>
-        </w:rPr>
-        <w:t xml:space="preserve">Chúng tôi xử lý theo hai hướng. Trước mắt, bổ sung cơ chế suy luận theo ô chồng lấn (cắt khung hình thành 2×3 ô và chạy detector trên từng ô ở độ phân giải gốc), nâng recall từ 0,19 lên 0,46 với cùng bộ trọng số. Về căn cơ, chuẩn bị quy trình fine-tune trên chính tập dữ liệu thật đã có 14.488 bounding box — xem notebook Colab kèm theo repo.</w:t>
+        <w:t xml:space="preserve">COCO chủ yếu gồm ảnh chụp ngang tầm mắt, còn camera giao thông đặt cao nhìn chếch xuống. Khi chạy ở kích thước ảnh 1280, có khung hình YOLO gốc gán nhãn "airplane" cho 35 đối tượng. Phương tiện trong MVTI không quá nhỏ, nên cắt ô không giải quyết được; hướng xử lý là fine-tune trên chính 14.488 bounding box của tập dữ liệu, xem notebook Colab kèm theo repo.</w:t>
       </w:r>
     </w:p>
     <w:p>
@@ -8350,7 +9511,7 @@
           <w:sz w:val="24"/>
           <w:szCs w:val="24"/>
         </w:rPr>
-        <w:t xml:space="preserve">Ranh giới giữa "dòng xe đông" và "xung đột" vốn mờ. Phần lớn cảnh báo bị tính là sai thực chất là các cặp xe có khoảng cách thật dưới 1 m — tức là chúng đã đến rất gần nhau, chỉ là không thoả toàn bộ tiêu chí của nhãn chuẩn. Đây là hiện tượng đã được ghi nhận trong tài liệu nghiên cứu traffic conflict technique: ngay cả người gán nhãn có kinh nghiệm cũng bất đồng ở dải TTC 2–3 giây.</w:t>
+        <w:t xml:space="preserve">Ranh giới giữa "dòng xe đông" và "xung đột" vốn mờ. Phần lớn cảnh báo bị tính là sai thực chất là các cặp xe có khoảng cách thật dưới 1 m - tức là chúng đã đến rất gần nhau, chỉ là không thoả toàn bộ tiêu chí của nhãn chuẩn. Đây là hiện tượng đã được ghi nhận trong tài liệu nghiên cứu traffic conflict technique: ngay cả người gán nhãn có kinh nghiệm cũng bất đồng ở dải TTC 2-3 giây.</w:t>
       </w:r>
     </w:p>
     <w:p>
@@ -8400,7 +9561,7 @@
           <w:sz w:val="24"/>
           <w:szCs w:val="24"/>
         </w:rPr>
-        <w:t xml:space="preserve">Với mục đích thực tế của hệ thống — xếp hạng mức nguy hiểm giữa các giao lộ và chỉ ra điểm nóng cần ưu tiên — thì chỉ số quan trọng là Recall ở dải nguy cấp, và con số đó đạt 0,792. Các cảnh báo ở ranh giới có thể được lọc bằng ngưỡng Risk Score khi vận hành thực tế, vì thang điểm đã được hiệu chỉnh để phân biệt tốt.</w:t>
+        <w:t xml:space="preserve">Với mục đích thực tế của hệ thống - xếp hạng mức nguy hiểm giữa các giao lộ và chỉ ra điểm nóng cần ưu tiên - thì chỉ số quan trọng là Recall ở dải nguy cấp, và con số đó đạt 0,792. Các cảnh báo ở ranh giới có thể lọc thêm bằng ngưỡng Risk Score khi vận hành.</w:t>
       </w:r>
     </w:p>
     <w:p>
@@ -9064,6 +10225,273 @@
           </w:p>
         </w:tc>
       </w:tr>
+      <w:tr>
+        <w:trPr>
+          <w:cantSplit/>
+        </w:trPr>
+        <w:tc>
+          <w:tcPr>
+            <w:tcW w:type="dxa" w:w="2564"/>
+            <w:tcMar>
+              <w:top w:type="dxa" w:w="60"/>
+              <w:left w:type="dxa" w:w="90"/>
+              <w:bottom w:type="dxa" w:w="60"/>
+              <w:right w:type="dxa" w:w="90"/>
+            </w:tcMar>
+          </w:tcPr>
+          <w:p>
+            <w:pPr>
+              <w:spacing w:after="0" w:line="240"/>
+              <w:jc w:val="left"/>
+            </w:pPr>
+            <w:r>
+              <w:rPr>
+                <w:rFonts w:ascii="Times New Roman" w:cs="Times New Roman" w:eastAsia="Times New Roman" w:hAnsi="Times New Roman"/>
+                <w:b w:val="false"/>
+                <w:bCs w:val="false"/>
+                <w:color w:val="000000"/>
+                <w:sz w:val="20"/>
+                <w:szCs w:val="20"/>
+              </w:rPr>
+              <w:t xml:space="preserve">Trình mô phỏng chưa chống va chạm</w:t>
+            </w:r>
+          </w:p>
+        </w:tc>
+        <w:tc>
+          <w:tcPr>
+            <w:tcW w:type="dxa" w:w="2958"/>
+            <w:tcMar>
+              <w:top w:type="dxa" w:w="60"/>
+              <w:left w:type="dxa" w:w="90"/>
+              <w:bottom w:type="dxa" w:w="60"/>
+              <w:right w:type="dxa" w:w="90"/>
+            </w:tcMar>
+          </w:tcPr>
+          <w:p>
+            <w:pPr>
+              <w:spacing w:after="0" w:line="240"/>
+              <w:jc w:val="center"/>
+            </w:pPr>
+            <w:r>
+              <w:rPr>
+                <w:rFonts w:ascii="Times New Roman" w:cs="Times New Roman" w:eastAsia="Times New Roman" w:hAnsi="Times New Roman"/>
+                <w:b w:val="false"/>
+                <w:bCs w:val="false"/>
+                <w:color w:val="000000"/>
+                <w:sz w:val="20"/>
+                <w:szCs w:val="20"/>
+              </w:rPr>
+              <w:t xml:space="preserve">Một phần nhãn chuẩn là lúc thân xe chồng lên nhau</w:t>
+            </w:r>
+          </w:p>
+        </w:tc>
+        <w:tc>
+          <w:tcPr>
+            <w:tcW w:type="dxa" w:w="3550"/>
+            <w:tcMar>
+              <w:top w:type="dxa" w:w="60"/>
+              <w:left w:type="dxa" w:w="90"/>
+              <w:bottom w:type="dxa" w:w="60"/>
+              <w:right w:type="dxa" w:w="90"/>
+            </w:tcMar>
+          </w:tcPr>
+          <w:p>
+            <w:pPr>
+              <w:spacing w:after="0" w:line="240"/>
+              <w:jc w:val="center"/>
+            </w:pPr>
+            <w:r>
+              <w:rPr>
+                <w:rFonts w:ascii="Times New Roman" w:cs="Times New Roman" w:eastAsia="Times New Roman" w:hAnsi="Times New Roman"/>
+                <w:b w:val="false"/>
+                <w:bCs w:val="false"/>
+                <w:color w:val="000000"/>
+                <w:sz w:val="20"/>
+                <w:szCs w:val="20"/>
+              </w:rPr>
+              <w:t xml:space="preserve">Thêm ràng buộc va chạm; hiện báo cáo tách riêng nhóm này</w:t>
+            </w:r>
+          </w:p>
+        </w:tc>
+      </w:tr>
+      <w:tr>
+        <w:trPr>
+          <w:cantSplit/>
+        </w:trPr>
+        <w:tc>
+          <w:tcPr>
+            <w:tcW w:type="dxa" w:w="2564"/>
+            <w:tcMar>
+              <w:top w:type="dxa" w:w="60"/>
+              <w:left w:type="dxa" w:w="90"/>
+              <w:bottom w:type="dxa" w:w="60"/>
+              <w:right w:type="dxa" w:w="90"/>
+            </w:tcMar>
+          </w:tcPr>
+          <w:p>
+            <w:pPr>
+              <w:spacing w:after="0" w:line="240"/>
+              <w:jc w:val="left"/>
+            </w:pPr>
+            <w:r>
+              <w:rPr>
+                <w:rFonts w:ascii="Times New Roman" w:cs="Times New Roman" w:eastAsia="Times New Roman" w:hAnsi="Times New Roman"/>
+                <w:b w:val="false"/>
+                <w:bCs w:val="false"/>
+                <w:color w:val="000000"/>
+                <w:sz w:val="20"/>
+                <w:szCs w:val="20"/>
+              </w:rPr>
+              <w:t xml:space="preserve">Tốc độ trên CPU</w:t>
+            </w:r>
+          </w:p>
+        </w:tc>
+        <w:tc>
+          <w:tcPr>
+            <w:tcW w:type="dxa" w:w="2958"/>
+            <w:tcMar>
+              <w:top w:type="dxa" w:w="60"/>
+              <w:left w:type="dxa" w:w="90"/>
+              <w:bottom w:type="dxa" w:w="60"/>
+              <w:right w:type="dxa" w:w="90"/>
+            </w:tcMar>
+          </w:tcPr>
+          <w:p>
+            <w:pPr>
+              <w:spacing w:after="0" w:line="240"/>
+              <w:jc w:val="center"/>
+            </w:pPr>
+            <w:r>
+              <w:rPr>
+                <w:rFonts w:ascii="Times New Roman" w:cs="Times New Roman" w:eastAsia="Times New Roman" w:hAnsi="Times New Roman"/>
+                <w:b w:val="false"/>
+                <w:bCs w:val="false"/>
+                <w:color w:val="000000"/>
+                <w:sz w:val="20"/>
+                <w:szCs w:val="20"/>
+              </w:rPr>
+              <w:t xml:space="preserve">Toàn hệ thống có YOLO chưa đạt 25 FPS trên CPU 2 lõi</w:t>
+            </w:r>
+          </w:p>
+        </w:tc>
+        <w:tc>
+          <w:tcPr>
+            <w:tcW w:type="dxa" w:w="3550"/>
+            <w:tcMar>
+              <w:top w:type="dxa" w:w="60"/>
+              <w:left w:type="dxa" w:w="90"/>
+              <w:bottom w:type="dxa" w:w="60"/>
+              <w:right w:type="dxa" w:w="90"/>
+            </w:tcMar>
+          </w:tcPr>
+          <w:p>
+            <w:pPr>
+              <w:spacing w:after="0" w:line="240"/>
+              <w:jc w:val="center"/>
+            </w:pPr>
+            <w:r>
+              <w:rPr>
+                <w:rFonts w:ascii="Times New Roman" w:cs="Times New Roman" w:eastAsia="Times New Roman" w:hAnsi="Times New Roman"/>
+                <w:b w:val="false"/>
+                <w:bCs w:val="false"/>
+                <w:color w:val="000000"/>
+                <w:sz w:val="20"/>
+                <w:szCs w:val="20"/>
+              </w:rPr>
+              <w:t xml:space="preserve">GPU cho khâu phát hiện, hoặc chạy detector thưa hơn</w:t>
+            </w:r>
+          </w:p>
+        </w:tc>
+      </w:tr>
+      <w:tr>
+        <w:trPr>
+          <w:cantSplit/>
+        </w:trPr>
+        <w:tc>
+          <w:tcPr>
+            <w:tcW w:type="dxa" w:w="2564"/>
+            <w:tcMar>
+              <w:top w:type="dxa" w:w="60"/>
+              <w:left w:type="dxa" w:w="90"/>
+              <w:bottom w:type="dxa" w:w="60"/>
+              <w:right w:type="dxa" w:w="90"/>
+            </w:tcMar>
+          </w:tcPr>
+          <w:p>
+            <w:pPr>
+              <w:spacing w:after="0" w:line="240"/>
+              <w:jc w:val="left"/>
+            </w:pPr>
+            <w:r>
+              <w:rPr>
+                <w:rFonts w:ascii="Times New Roman" w:cs="Times New Roman" w:eastAsia="Times New Roman" w:hAnsi="Times New Roman"/>
+                <w:b w:val="false"/>
+                <w:bCs w:val="false"/>
+                <w:color w:val="000000"/>
+                <w:sz w:val="20"/>
+                <w:szCs w:val="20"/>
+              </w:rPr>
+              <w:t xml:space="preserve">Nhận dạng hành vi quá nhạy</w:t>
+            </w:r>
+          </w:p>
+        </w:tc>
+        <w:tc>
+          <w:tcPr>
+            <w:tcW w:type="dxa" w:w="2958"/>
+            <w:tcMar>
+              <w:top w:type="dxa" w:w="60"/>
+              <w:left w:type="dxa" w:w="90"/>
+              <w:bottom w:type="dxa" w:w="60"/>
+              <w:right w:type="dxa" w:w="90"/>
+            </w:tcMar>
+          </w:tcPr>
+          <w:p>
+            <w:pPr>
+              <w:spacing w:after="0" w:line="240"/>
+              <w:jc w:val="center"/>
+            </w:pPr>
+            <w:r>
+              <w:rPr>
+                <w:rFonts w:ascii="Times New Roman" w:cs="Times New Roman" w:eastAsia="Times New Roman" w:hAnsi="Times New Roman"/>
+                <w:b w:val="false"/>
+                <w:bCs w:val="false"/>
+                <w:color w:val="000000"/>
+                <w:sz w:val="20"/>
+                <w:szCs w:val="20"/>
+              </w:rPr>
+              <w:t xml:space="preserve">Gần như mọi xe bị gắn cờ bất thường</w:t>
+            </w:r>
+          </w:p>
+        </w:tc>
+        <w:tc>
+          <w:tcPr>
+            <w:tcW w:type="dxa" w:w="3550"/>
+            <w:tcMar>
+              <w:top w:type="dxa" w:w="60"/>
+              <w:left w:type="dxa" w:w="90"/>
+              <w:bottom w:type="dxa" w:w="60"/>
+              <w:right w:type="dxa" w:w="90"/>
+            </w:tcMar>
+          </w:tcPr>
+          <w:p>
+            <w:pPr>
+              <w:spacing w:after="0" w:line="240"/>
+              <w:jc w:val="center"/>
+            </w:pPr>
+            <w:r>
+              <w:rPr>
+                <w:rFonts w:ascii="Times New Roman" w:cs="Times New Roman" w:eastAsia="Times New Roman" w:hAnsi="Times New Roman"/>
+                <w:b w:val="false"/>
+                <w:bCs w:val="false"/>
+                <w:color w:val="000000"/>
+                <w:sz w:val="20"/>
+                <w:szCs w:val="20"/>
+              </w:rPr>
+              <w:t xml:space="preserve">Làm mượt vận tốc trước khi áp ngưỡng; hiệu chỉnh lại ngưỡng</w:t>
+            </w:r>
+          </w:p>
+        </w:tc>
+      </w:tr>
     </w:tbl>
     <w:p>
       <w:pPr>
@@ -9224,7 +10652,7 @@
           <w:sz w:val="24"/>
           <w:szCs w:val="24"/>
         </w:rPr>
-        <w:t xml:space="preserve">Bản kê khai đầy đủ trong docs/ke_khai_cong_cu.md và docs/dataset_license.md. Tóm tắt:</w:t>
+        <w:t xml:space="preserve">Bản kê khai công cụ trí tuệ nhân tạo và lịch sử câu lệnh được nộp kèm hồ sơ dự thi theo đúng yêu cầu của Thể lệ; nguồn dữ liệu và giấy phép nằm trong docs/dataset_license.md. Tóm tắt:</w:t>
       </w:r>
     </w:p>
     <w:p>
@@ -9243,7 +10671,7 @@
           <w:sz w:val="24"/>
           <w:szCs w:val="24"/>
         </w:rPr>
-        <w:t xml:space="preserve">Công cụ AI hỗ trợ sinh mã: Claude (Anthropic). Toàn bộ quyết định thiết kế, lựa chọn ngưỡng, phương pháp đánh giá và diễn giải kết quả do nhóm thực hiện và chịu trách nhiệm.</w:t>
+        <w:t xml:space="preserve">Có sử dụng trợ lý lập trình AI để hỗ trợ viết mã và tài liệu. Toàn bộ quyết định thiết kế, lựa chọn ngưỡng, phương pháp đánh giá và diễn giải kết quả do nhóm thực hiện và chịu trách nhiệm.</w:t>
       </w:r>
     </w:p>
     <w:p>
@@ -9300,7 +10728,7 @@
           <w:sz w:val="24"/>
           <w:szCs w:val="24"/>
         </w:rPr>
-        <w:t xml:space="preserve">Dataset kế thừa: Multi-view Traffic Intersection (Møgelmose), UCSD Highway Traffic (Chan &amp; Vasconcelos, 2005 — đã trích dẫn theo yêu cầu).</w:t>
+        <w:t xml:space="preserve">Dataset kế thừa: Multi-view Traffic Intersection (Møgelmose), UCSD Highway Traffic (Chan &amp; Vasconcelos, 2005 - đã trích dẫn theo yêu cầu).</w:t>
       </w:r>
     </w:p>
     <w:p>
@@ -9691,7 +11119,7 @@
                 <w:sz w:val="20"/>
                 <w:szCs w:val="20"/>
               </w:rPr>
-              <w:t xml:space="preserve">Bản kê khai công cụ AI</w:t>
+              <w:t xml:space="preserve">Bản kê khai công cụ AI và lịch sử câu lệnh</w:t>
             </w:r>
           </w:p>
         </w:tc>
@@ -9719,7 +11147,7 @@
                 <w:sz w:val="20"/>
                 <w:szCs w:val="20"/>
               </w:rPr>
-              <w:t xml:space="preserve">docs/ke_khai_cong_cu.md</w:t>
+              <w:t xml:space="preserve">Nộp kèm hồ sơ dự thi</w:t>
             </w:r>
           </w:p>
         </w:tc>
@@ -9752,7 +11180,7 @@
                 <w:sz w:val="20"/>
                 <w:szCs w:val="20"/>
               </w:rPr>
-              <w:t xml:space="preserve">Prompt Log</w:t>
+              <w:t xml:space="preserve">Kết quả đánh giá dạng máy đọc</w:t>
             </w:r>
           </w:p>
         </w:tc>
@@ -9780,7 +11208,7 @@
                 <w:sz w:val="20"/>
                 <w:szCs w:val="20"/>
               </w:rPr>
-              <w:t xml:space="preserve">docs/prompt_log.md</w:t>
+              <w:t xml:space="preserve">data/outputs/evaluation.json, evaluation_real.json, evaluation_real_tiled.json</w:t>
             </w:r>
           </w:p>
         </w:tc>
@@ -9813,7 +11241,7 @@
                 <w:sz w:val="20"/>
                 <w:szCs w:val="20"/>
               </w:rPr>
-              <w:t xml:space="preserve">Kết quả đánh giá dạng máy đọc</w:t>
+              <w:t xml:space="preserve">Bộ kiểm thử tự động</w:t>
             </w:r>
           </w:p>
         </w:tc>
@@ -9841,68 +11269,7 @@
                 <w:sz w:val="20"/>
                 <w:szCs w:val="20"/>
               </w:rPr>
-              <w:t xml:space="preserve">data/outputs/evaluation.json</w:t>
-            </w:r>
-          </w:p>
-        </w:tc>
-      </w:tr>
-      <w:tr>
-        <w:trPr>
-          <w:cantSplit/>
-        </w:trPr>
-        <w:tc>
-          <w:tcPr>
-            <w:tcW w:type="dxa" w:w="3574"/>
-            <w:tcMar>
-              <w:top w:type="dxa" w:w="60"/>
-              <w:left w:type="dxa" w:w="90"/>
-              <w:bottom w:type="dxa" w:w="60"/>
-              <w:right w:type="dxa" w:w="90"/>
-            </w:tcMar>
-          </w:tcPr>
-          <w:p>
-            <w:pPr>
-              <w:spacing w:after="0" w:line="240"/>
-              <w:jc w:val="left"/>
-            </w:pPr>
-            <w:r>
-              <w:rPr>
-                <w:rFonts w:ascii="Times New Roman" w:cs="Times New Roman" w:eastAsia="Times New Roman" w:hAnsi="Times New Roman"/>
-                <w:b w:val="false"/>
-                <w:bCs w:val="false"/>
-                <w:color w:val="000000"/>
-                <w:sz w:val="20"/>
-                <w:szCs w:val="20"/>
-              </w:rPr>
-              <w:t xml:space="preserve">Bộ kiểm thử tự động</w:t>
-            </w:r>
-          </w:p>
-        </w:tc>
-        <w:tc>
-          <w:tcPr>
-            <w:tcW w:type="dxa" w:w="5498"/>
-            <w:tcMar>
-              <w:top w:type="dxa" w:w="60"/>
-              <w:left w:type="dxa" w:w="90"/>
-              <w:bottom w:type="dxa" w:w="60"/>
-              <w:right w:type="dxa" w:w="90"/>
-            </w:tcMar>
-          </w:tcPr>
-          <w:p>
-            <w:pPr>
-              <w:spacing w:after="0" w:line="240"/>
-              <w:jc w:val="center"/>
-            </w:pPr>
-            <w:r>
-              <w:rPr>
-                <w:rFonts w:ascii="Times New Roman" w:cs="Times New Roman" w:eastAsia="Times New Roman" w:hAnsi="Times New Roman"/>
-                <w:b w:val="false"/>
-                <w:bCs w:val="false"/>
-                <w:color w:val="000000"/>
-                <w:sz w:val="20"/>
-                <w:szCs w:val="20"/>
-              </w:rPr>
-              <w:t xml:space="preserve">tests/ — 81 test, chạy bằng pytest</w:t>
+              <w:t xml:space="preserve">tests/ - 91 test, chạy bằng pytest và GitHub Actions</w:t>
             </w:r>
           </w:p>
         </w:tc>
@@ -10163,7 +11530,7 @@
         <w:sz w:val="18"/>
         <w:szCs w:val="18"/>
       </w:rPr>
-      <w:t xml:space="preserve">SafeRoad AI — Bảng C — Trang </w:t>
+      <w:t xml:space="preserve">SafeRoad AI - Bảng C - Trang </w:t>
     </w:r>
     <w:r>
       <w:rPr>

</xml_diff>